<commit_message>
UPdated with DB implementation in Spring Boot
</commit_message>
<xml_diff>
--- a/Spring Boot.docx
+++ b/Spring Boot.docx
@@ -48,7 +48,7 @@
           <w:r>
             <w:fldChar w:fldCharType="separate"/>
           </w:r>
-          <w:hyperlink w:anchor="_Toc218768149" w:history="1">
+          <w:hyperlink w:anchor="_Toc219808015" w:history="1">
             <w:r>
               <w:rPr>
                 <w:rStyle w:val="Hyperlink"/>
@@ -75,7 +75,7 @@
                 <w:noProof/>
                 <w:webHidden/>
               </w:rPr>
-              <w:instrText xml:space="preserve"> PAGEREF _Toc218768149 \h </w:instrText>
+              <w:instrText xml:space="preserve"> PAGEREF _Toc219808015 \h </w:instrText>
             </w:r>
             <w:r>
               <w:rPr>
@@ -117,7 +117,7 @@
               <w:lang w:val="en-GB" w:eastAsia="en-GB"/>
             </w:rPr>
           </w:pPr>
-          <w:hyperlink w:anchor="_Toc218768150" w:history="1">
+          <w:hyperlink w:anchor="_Toc219808016" w:history="1">
             <w:r>
               <w:rPr>
                 <w:rStyle w:val="Hyperlink"/>
@@ -159,7 +159,7 @@
                 <w:noProof/>
                 <w:webHidden/>
               </w:rPr>
-              <w:instrText xml:space="preserve"> PAGEREF _Toc218768150 \h </w:instrText>
+              <w:instrText xml:space="preserve"> PAGEREF _Toc219808016 \h </w:instrText>
             </w:r>
             <w:r>
               <w:rPr>
@@ -201,7 +201,7 @@
               <w:lang w:val="en-GB" w:eastAsia="en-GB"/>
             </w:rPr>
           </w:pPr>
-          <w:hyperlink w:anchor="_Toc218768151" w:history="1">
+          <w:hyperlink w:anchor="_Toc219808017" w:history="1">
             <w:r>
               <w:rPr>
                 <w:rStyle w:val="Hyperlink"/>
@@ -243,7 +243,7 @@
                 <w:noProof/>
                 <w:webHidden/>
               </w:rPr>
-              <w:instrText xml:space="preserve"> PAGEREF _Toc218768151 \h </w:instrText>
+              <w:instrText xml:space="preserve"> PAGEREF _Toc219808017 \h </w:instrText>
             </w:r>
             <w:r>
               <w:rPr>
@@ -285,7 +285,7 @@
               <w:lang w:val="en-GB" w:eastAsia="en-GB"/>
             </w:rPr>
           </w:pPr>
-          <w:hyperlink w:anchor="_Toc218768152" w:history="1">
+          <w:hyperlink w:anchor="_Toc219808018" w:history="1">
             <w:r>
               <w:rPr>
                 <w:rStyle w:val="Hyperlink"/>
@@ -312,7 +312,7 @@
                 <w:noProof/>
                 <w:webHidden/>
               </w:rPr>
-              <w:instrText xml:space="preserve"> PAGEREF _Toc218768152 \h </w:instrText>
+              <w:instrText xml:space="preserve"> PAGEREF _Toc219808018 \h </w:instrText>
             </w:r>
             <w:r>
               <w:rPr>
@@ -354,7 +354,7 @@
               <w:lang w:val="en-GB" w:eastAsia="en-GB"/>
             </w:rPr>
           </w:pPr>
-          <w:hyperlink w:anchor="_Toc218768153" w:history="1">
+          <w:hyperlink w:anchor="_Toc219808019" w:history="1">
             <w:r>
               <w:rPr>
                 <w:rStyle w:val="Hyperlink"/>
@@ -396,7 +396,7 @@
                 <w:noProof/>
                 <w:webHidden/>
               </w:rPr>
-              <w:instrText xml:space="preserve"> PAGEREF _Toc218768153 \h </w:instrText>
+              <w:instrText xml:space="preserve"> PAGEREF _Toc219808019 \h </w:instrText>
             </w:r>
             <w:r>
               <w:rPr>
@@ -438,7 +438,7 @@
               <w:lang w:val="en-GB" w:eastAsia="en-GB"/>
             </w:rPr>
           </w:pPr>
-          <w:hyperlink w:anchor="_Toc218768154" w:history="1">
+          <w:hyperlink w:anchor="_Toc219808020" w:history="1">
             <w:r>
               <w:rPr>
                 <w:rStyle w:val="Hyperlink"/>
@@ -465,7 +465,7 @@
                 <w:noProof/>
                 <w:webHidden/>
               </w:rPr>
-              <w:instrText xml:space="preserve"> PAGEREF _Toc218768154 \h </w:instrText>
+              <w:instrText xml:space="preserve"> PAGEREF _Toc219808020 \h </w:instrText>
             </w:r>
             <w:r>
               <w:rPr>
@@ -507,7 +507,7 @@
               <w:lang w:val="en-GB" w:eastAsia="en-GB"/>
             </w:rPr>
           </w:pPr>
-          <w:hyperlink w:anchor="_Toc218768155" w:history="1">
+          <w:hyperlink w:anchor="_Toc219808021" w:history="1">
             <w:r>
               <w:rPr>
                 <w:rStyle w:val="Hyperlink"/>
@@ -549,7 +549,7 @@
                 <w:noProof/>
                 <w:webHidden/>
               </w:rPr>
-              <w:instrText xml:space="preserve"> PAGEREF _Toc218768155 \h </w:instrText>
+              <w:instrText xml:space="preserve"> PAGEREF _Toc219808021 \h </w:instrText>
             </w:r>
             <w:r>
               <w:rPr>
@@ -591,7 +591,7 @@
               <w:lang w:val="en-GB" w:eastAsia="en-GB"/>
             </w:rPr>
           </w:pPr>
-          <w:hyperlink w:anchor="_Toc218768156" w:history="1">
+          <w:hyperlink w:anchor="_Toc219808022" w:history="1">
             <w:r>
               <w:rPr>
                 <w:rStyle w:val="Hyperlink"/>
@@ -633,7 +633,7 @@
                 <w:noProof/>
                 <w:webHidden/>
               </w:rPr>
-              <w:instrText xml:space="preserve"> PAGEREF _Toc218768156 \h </w:instrText>
+              <w:instrText xml:space="preserve"> PAGEREF _Toc219808022 \h </w:instrText>
             </w:r>
             <w:r>
               <w:rPr>
@@ -675,7 +675,7 @@
               <w:lang w:val="en-GB" w:eastAsia="en-GB"/>
             </w:rPr>
           </w:pPr>
-          <w:hyperlink w:anchor="_Toc218768157" w:history="1">
+          <w:hyperlink w:anchor="_Toc219808023" w:history="1">
             <w:r>
               <w:rPr>
                 <w:rStyle w:val="Hyperlink"/>
@@ -717,7 +717,7 @@
                 <w:noProof/>
                 <w:webHidden/>
               </w:rPr>
-              <w:instrText xml:space="preserve"> PAGEREF _Toc218768157 \h </w:instrText>
+              <w:instrText xml:space="preserve"> PAGEREF _Toc219808023 \h </w:instrText>
             </w:r>
             <w:r>
               <w:rPr>
@@ -759,7 +759,7 @@
               <w:lang w:val="en-GB" w:eastAsia="en-GB"/>
             </w:rPr>
           </w:pPr>
-          <w:hyperlink w:anchor="_Toc218768158" w:history="1">
+          <w:hyperlink w:anchor="_Toc219808024" w:history="1">
             <w:r>
               <w:rPr>
                 <w:rStyle w:val="Hyperlink"/>
@@ -801,7 +801,7 @@
                 <w:noProof/>
                 <w:webHidden/>
               </w:rPr>
-              <w:instrText xml:space="preserve"> PAGEREF _Toc218768158 \h </w:instrText>
+              <w:instrText xml:space="preserve"> PAGEREF _Toc219808024 \h </w:instrText>
             </w:r>
             <w:r>
               <w:rPr>
@@ -843,7 +843,7 @@
               <w:lang w:val="en-GB" w:eastAsia="en-GB"/>
             </w:rPr>
           </w:pPr>
-          <w:hyperlink w:anchor="_Toc218768159" w:history="1">
+          <w:hyperlink w:anchor="_Toc219808025" w:history="1">
             <w:r>
               <w:rPr>
                 <w:rStyle w:val="Hyperlink"/>
@@ -885,7 +885,7 @@
                 <w:noProof/>
                 <w:webHidden/>
               </w:rPr>
-              <w:instrText xml:space="preserve"> PAGEREF _Toc218768159 \h </w:instrText>
+              <w:instrText xml:space="preserve"> PAGEREF _Toc219808025 \h </w:instrText>
             </w:r>
             <w:r>
               <w:rPr>
@@ -927,7 +927,7 @@
               <w:lang w:val="en-GB" w:eastAsia="en-GB"/>
             </w:rPr>
           </w:pPr>
-          <w:hyperlink w:anchor="_Toc218768160" w:history="1">
+          <w:hyperlink w:anchor="_Toc219808026" w:history="1">
             <w:r>
               <w:rPr>
                 <w:rStyle w:val="Hyperlink"/>
@@ -969,7 +969,7 @@
                 <w:noProof/>
                 <w:webHidden/>
               </w:rPr>
-              <w:instrText xml:space="preserve"> PAGEREF _Toc218768160 \h </w:instrText>
+              <w:instrText xml:space="preserve"> PAGEREF _Toc219808026 \h </w:instrText>
             </w:r>
             <w:r>
               <w:rPr>
@@ -1011,7 +1011,7 @@
               <w:lang w:val="en-GB" w:eastAsia="en-GB"/>
             </w:rPr>
           </w:pPr>
-          <w:hyperlink w:anchor="_Toc218768161" w:history="1">
+          <w:hyperlink w:anchor="_Toc219808027" w:history="1">
             <w:r>
               <w:rPr>
                 <w:rStyle w:val="Hyperlink"/>
@@ -1053,7 +1053,7 @@
                 <w:noProof/>
                 <w:webHidden/>
               </w:rPr>
-              <w:instrText xml:space="preserve"> PAGEREF _Toc218768161 \h </w:instrText>
+              <w:instrText xml:space="preserve"> PAGEREF _Toc219808027 \h </w:instrText>
             </w:r>
             <w:r>
               <w:rPr>
@@ -1095,7 +1095,7 @@
               <w:lang w:val="en-GB" w:eastAsia="en-GB"/>
             </w:rPr>
           </w:pPr>
-          <w:hyperlink w:anchor="_Toc218768162" w:history="1">
+          <w:hyperlink w:anchor="_Toc219808028" w:history="1">
             <w:r>
               <w:rPr>
                 <w:rStyle w:val="Hyperlink"/>
@@ -1137,7 +1137,7 @@
                 <w:noProof/>
                 <w:webHidden/>
               </w:rPr>
-              <w:instrText xml:space="preserve"> PAGEREF _Toc218768162 \h </w:instrText>
+              <w:instrText xml:space="preserve"> PAGEREF _Toc219808028 \h </w:instrText>
             </w:r>
             <w:r>
               <w:rPr>
@@ -1179,7 +1179,7 @@
               <w:lang w:val="en-GB" w:eastAsia="en-GB"/>
             </w:rPr>
           </w:pPr>
-          <w:hyperlink w:anchor="_Toc218768163" w:history="1">
+          <w:hyperlink w:anchor="_Toc219808029" w:history="1">
             <w:r>
               <w:rPr>
                 <w:rStyle w:val="Hyperlink"/>
@@ -1206,7 +1206,7 @@
                 <w:noProof/>
                 <w:webHidden/>
               </w:rPr>
-              <w:instrText xml:space="preserve"> PAGEREF _Toc218768163 \h </w:instrText>
+              <w:instrText xml:space="preserve"> PAGEREF _Toc219808029 \h </w:instrText>
             </w:r>
             <w:r>
               <w:rPr>
@@ -1248,7 +1248,7 @@
               <w:lang w:val="en-GB" w:eastAsia="en-GB"/>
             </w:rPr>
           </w:pPr>
-          <w:hyperlink w:anchor="_Toc218768164" w:history="1">
+          <w:hyperlink w:anchor="_Toc219808030" w:history="1">
             <w:r>
               <w:rPr>
                 <w:rStyle w:val="Hyperlink"/>
@@ -1275,7 +1275,7 @@
                 <w:noProof/>
                 <w:webHidden/>
               </w:rPr>
-              <w:instrText xml:space="preserve"> PAGEREF _Toc218768164 \h </w:instrText>
+              <w:instrText xml:space="preserve"> PAGEREF _Toc219808030 \h </w:instrText>
             </w:r>
             <w:r>
               <w:rPr>
@@ -1317,7 +1317,7 @@
               <w:lang w:val="en-GB" w:eastAsia="en-GB"/>
             </w:rPr>
           </w:pPr>
-          <w:hyperlink w:anchor="_Toc218768165" w:history="1">
+          <w:hyperlink w:anchor="_Toc219808031" w:history="1">
             <w:r>
               <w:rPr>
                 <w:rStyle w:val="Hyperlink"/>
@@ -1344,7 +1344,7 @@
                 <w:noProof/>
                 <w:webHidden/>
               </w:rPr>
-              <w:instrText xml:space="preserve"> PAGEREF _Toc218768165 \h </w:instrText>
+              <w:instrText xml:space="preserve"> PAGEREF _Toc219808031 \h </w:instrText>
             </w:r>
             <w:r>
               <w:rPr>
@@ -1386,7 +1386,7 @@
               <w:lang w:val="en-GB" w:eastAsia="en-GB"/>
             </w:rPr>
           </w:pPr>
-          <w:hyperlink w:anchor="_Toc218768166" w:history="1">
+          <w:hyperlink w:anchor="_Toc219808032" w:history="1">
             <w:r>
               <w:rPr>
                 <w:rStyle w:val="Hyperlink"/>
@@ -1413,7 +1413,7 @@
                 <w:noProof/>
                 <w:webHidden/>
               </w:rPr>
-              <w:instrText xml:space="preserve"> PAGEREF _Toc218768166 \h </w:instrText>
+              <w:instrText xml:space="preserve"> PAGEREF _Toc219808032 \h </w:instrText>
             </w:r>
             <w:r>
               <w:rPr>
@@ -1455,7 +1455,7 @@
               <w:lang w:val="en-GB" w:eastAsia="en-GB"/>
             </w:rPr>
           </w:pPr>
-          <w:hyperlink w:anchor="_Toc218768167" w:history="1">
+          <w:hyperlink w:anchor="_Toc219808033" w:history="1">
             <w:r>
               <w:rPr>
                 <w:rStyle w:val="Hyperlink"/>
@@ -1482,7 +1482,7 @@
                 <w:noProof/>
                 <w:webHidden/>
               </w:rPr>
-              <w:instrText xml:space="preserve"> PAGEREF _Toc218768167 \h </w:instrText>
+              <w:instrText xml:space="preserve"> PAGEREF _Toc219808033 \h </w:instrText>
             </w:r>
             <w:r>
               <w:rPr>
@@ -1524,7 +1524,7 @@
               <w:lang w:val="en-GB" w:eastAsia="en-GB"/>
             </w:rPr>
           </w:pPr>
-          <w:hyperlink w:anchor="_Toc218768168" w:history="1">
+          <w:hyperlink w:anchor="_Toc219808034" w:history="1">
             <w:r>
               <w:rPr>
                 <w:rStyle w:val="Hyperlink"/>
@@ -1551,7 +1551,7 @@
                 <w:noProof/>
                 <w:webHidden/>
               </w:rPr>
-              <w:instrText xml:space="preserve"> PAGEREF _Toc218768168 \h </w:instrText>
+              <w:instrText xml:space="preserve"> PAGEREF _Toc219808034 \h </w:instrText>
             </w:r>
             <w:r>
               <w:rPr>
@@ -1593,7 +1593,7 @@
               <w:lang w:val="en-GB" w:eastAsia="en-GB"/>
             </w:rPr>
           </w:pPr>
-          <w:hyperlink w:anchor="_Toc218768169" w:history="1">
+          <w:hyperlink w:anchor="_Toc219808035" w:history="1">
             <w:r>
               <w:rPr>
                 <w:rStyle w:val="Hyperlink"/>
@@ -1620,7 +1620,7 @@
                 <w:noProof/>
                 <w:webHidden/>
               </w:rPr>
-              <w:instrText xml:space="preserve"> PAGEREF _Toc218768169 \h </w:instrText>
+              <w:instrText xml:space="preserve"> PAGEREF _Toc219808035 \h </w:instrText>
             </w:r>
             <w:r>
               <w:rPr>
@@ -1662,7 +1662,7 @@
               <w:lang w:val="en-GB" w:eastAsia="en-GB"/>
             </w:rPr>
           </w:pPr>
-          <w:hyperlink w:anchor="_Toc218768170" w:history="1">
+          <w:hyperlink w:anchor="_Toc219808036" w:history="1">
             <w:r>
               <w:rPr>
                 <w:rStyle w:val="Hyperlink"/>
@@ -1689,7 +1689,7 @@
                 <w:noProof/>
                 <w:webHidden/>
               </w:rPr>
-              <w:instrText xml:space="preserve"> PAGEREF _Toc218768170 \h </w:instrText>
+              <w:instrText xml:space="preserve"> PAGEREF _Toc219808036 \h </w:instrText>
             </w:r>
             <w:r>
               <w:rPr>
@@ -1731,7 +1731,7 @@
               <w:lang w:val="en-GB" w:eastAsia="en-GB"/>
             </w:rPr>
           </w:pPr>
-          <w:hyperlink w:anchor="_Toc218768171" w:history="1">
+          <w:hyperlink w:anchor="_Toc219808037" w:history="1">
             <w:r>
               <w:rPr>
                 <w:rStyle w:val="Hyperlink"/>
@@ -1758,7 +1758,7 @@
                 <w:noProof/>
                 <w:webHidden/>
               </w:rPr>
-              <w:instrText xml:space="preserve"> PAGEREF _Toc218768171 \h </w:instrText>
+              <w:instrText xml:space="preserve"> PAGEREF _Toc219808037 \h </w:instrText>
             </w:r>
             <w:r>
               <w:rPr>
@@ -1800,7 +1800,7 @@
               <w:lang w:val="en-GB" w:eastAsia="en-GB"/>
             </w:rPr>
           </w:pPr>
-          <w:hyperlink w:anchor="_Toc218768172" w:history="1">
+          <w:hyperlink w:anchor="_Toc219808038" w:history="1">
             <w:r>
               <w:rPr>
                 <w:rStyle w:val="Hyperlink"/>
@@ -1827,7 +1827,7 @@
                 <w:noProof/>
                 <w:webHidden/>
               </w:rPr>
-              <w:instrText xml:space="preserve"> PAGEREF _Toc218768172 \h </w:instrText>
+              <w:instrText xml:space="preserve"> PAGEREF _Toc219808038 \h </w:instrText>
             </w:r>
             <w:r>
               <w:rPr>
@@ -1869,7 +1869,7 @@
               <w:lang w:val="en-GB" w:eastAsia="en-GB"/>
             </w:rPr>
           </w:pPr>
-          <w:hyperlink w:anchor="_Toc218768173" w:history="1">
+          <w:hyperlink w:anchor="_Toc219808039" w:history="1">
             <w:r>
               <w:rPr>
                 <w:rStyle w:val="Hyperlink"/>
@@ -1896,7 +1896,7 @@
                 <w:noProof/>
                 <w:webHidden/>
               </w:rPr>
-              <w:instrText xml:space="preserve"> PAGEREF _Toc218768173 \h </w:instrText>
+              <w:instrText xml:space="preserve"> PAGEREF _Toc219808039 \h </w:instrText>
             </w:r>
             <w:r>
               <w:rPr>
@@ -1938,7 +1938,7 @@
               <w:lang w:val="en-GB" w:eastAsia="en-GB"/>
             </w:rPr>
           </w:pPr>
-          <w:hyperlink w:anchor="_Toc218768174" w:history="1">
+          <w:hyperlink w:anchor="_Toc219808040" w:history="1">
             <w:r>
               <w:rPr>
                 <w:rStyle w:val="Hyperlink"/>
@@ -1965,7 +1965,7 @@
                 <w:noProof/>
                 <w:webHidden/>
               </w:rPr>
-              <w:instrText xml:space="preserve"> PAGEREF _Toc218768174 \h </w:instrText>
+              <w:instrText xml:space="preserve"> PAGEREF _Toc219808040 \h </w:instrText>
             </w:r>
             <w:r>
               <w:rPr>
@@ -2007,7 +2007,7 @@
               <w:lang w:val="en-GB" w:eastAsia="en-GB"/>
             </w:rPr>
           </w:pPr>
-          <w:hyperlink w:anchor="_Toc218768175" w:history="1">
+          <w:hyperlink w:anchor="_Toc219808041" w:history="1">
             <w:r>
               <w:rPr>
                 <w:rStyle w:val="Hyperlink"/>
@@ -2034,7 +2034,7 @@
                 <w:noProof/>
                 <w:webHidden/>
               </w:rPr>
-              <w:instrText xml:space="preserve"> PAGEREF _Toc218768175 \h </w:instrText>
+              <w:instrText xml:space="preserve"> PAGEREF _Toc219808041 \h </w:instrText>
             </w:r>
             <w:r>
               <w:rPr>
@@ -2076,7 +2076,7 @@
               <w:lang w:val="en-GB" w:eastAsia="en-GB"/>
             </w:rPr>
           </w:pPr>
-          <w:hyperlink w:anchor="_Toc218768176" w:history="1">
+          <w:hyperlink w:anchor="_Toc219808042" w:history="1">
             <w:r>
               <w:rPr>
                 <w:rStyle w:val="Hyperlink"/>
@@ -2111,7 +2111,7 @@
                 <w:noProof/>
                 <w:webHidden/>
               </w:rPr>
-              <w:instrText xml:space="preserve"> PAGEREF _Toc218768176 \h </w:instrText>
+              <w:instrText xml:space="preserve"> PAGEREF _Toc219808042 \h </w:instrText>
             </w:r>
             <w:r>
               <w:rPr>
@@ -2153,7 +2153,7 @@
               <w:lang w:val="en-GB" w:eastAsia="en-GB"/>
             </w:rPr>
           </w:pPr>
-          <w:hyperlink w:anchor="_Toc218768177" w:history="1">
+          <w:hyperlink w:anchor="_Toc219808043" w:history="1">
             <w:r>
               <w:rPr>
                 <w:rStyle w:val="Hyperlink"/>
@@ -2180,7 +2180,7 @@
                 <w:noProof/>
                 <w:webHidden/>
               </w:rPr>
-              <w:instrText xml:space="preserve"> PAGEREF _Toc218768177 \h </w:instrText>
+              <w:instrText xml:space="preserve"> PAGEREF _Toc219808043 \h </w:instrText>
             </w:r>
             <w:r>
               <w:rPr>
@@ -2222,7 +2222,7 @@
               <w:lang w:val="en-GB" w:eastAsia="en-GB"/>
             </w:rPr>
           </w:pPr>
-          <w:hyperlink w:anchor="_Toc218768178" w:history="1">
+          <w:hyperlink w:anchor="_Toc219808044" w:history="1">
             <w:r>
               <w:rPr>
                 <w:rStyle w:val="Hyperlink"/>
@@ -2249,7 +2249,7 @@
                 <w:noProof/>
                 <w:webHidden/>
               </w:rPr>
-              <w:instrText xml:space="preserve"> PAGEREF _Toc218768178 \h </w:instrText>
+              <w:instrText xml:space="preserve"> PAGEREF _Toc219808044 \h </w:instrText>
             </w:r>
             <w:r>
               <w:rPr>
@@ -2291,7 +2291,7 @@
               <w:lang w:val="en-GB" w:eastAsia="en-GB"/>
             </w:rPr>
           </w:pPr>
-          <w:hyperlink w:anchor="_Toc218768179" w:history="1">
+          <w:hyperlink w:anchor="_Toc219808045" w:history="1">
             <w:r>
               <w:rPr>
                 <w:rStyle w:val="Hyperlink"/>
@@ -2318,7 +2318,7 @@
                 <w:noProof/>
                 <w:webHidden/>
               </w:rPr>
-              <w:instrText xml:space="preserve"> PAGEREF _Toc218768179 \h </w:instrText>
+              <w:instrText xml:space="preserve"> PAGEREF _Toc219808045 \h </w:instrText>
             </w:r>
             <w:r>
               <w:rPr>
@@ -2360,7 +2360,7 @@
               <w:lang w:val="en-GB" w:eastAsia="en-GB"/>
             </w:rPr>
           </w:pPr>
-          <w:hyperlink w:anchor="_Toc218768180" w:history="1">
+          <w:hyperlink w:anchor="_Toc219808046" w:history="1">
             <w:r>
               <w:rPr>
                 <w:rStyle w:val="Hyperlink"/>
@@ -2387,7 +2387,7 @@
                 <w:noProof/>
                 <w:webHidden/>
               </w:rPr>
-              <w:instrText xml:space="preserve"> PAGEREF _Toc218768180 \h </w:instrText>
+              <w:instrText xml:space="preserve"> PAGEREF _Toc219808046 \h </w:instrText>
             </w:r>
             <w:r>
               <w:rPr>
@@ -2429,7 +2429,7 @@
               <w:lang w:val="en-GB" w:eastAsia="en-GB"/>
             </w:rPr>
           </w:pPr>
-          <w:hyperlink w:anchor="_Toc218768181" w:history="1">
+          <w:hyperlink w:anchor="_Toc219808047" w:history="1">
             <w:r>
               <w:rPr>
                 <w:rStyle w:val="Hyperlink"/>
@@ -2456,7 +2456,7 @@
                 <w:noProof/>
                 <w:webHidden/>
               </w:rPr>
-              <w:instrText xml:space="preserve"> PAGEREF _Toc218768181 \h </w:instrText>
+              <w:instrText xml:space="preserve"> PAGEREF _Toc219808047 \h </w:instrText>
             </w:r>
             <w:r>
               <w:rPr>
@@ -2498,7 +2498,7 @@
               <w:lang w:val="en-GB" w:eastAsia="en-GB"/>
             </w:rPr>
           </w:pPr>
-          <w:hyperlink w:anchor="_Toc218768182" w:history="1">
+          <w:hyperlink w:anchor="_Toc219808048" w:history="1">
             <w:r>
               <w:rPr>
                 <w:rStyle w:val="Hyperlink"/>
@@ -2525,7 +2525,7 @@
                 <w:noProof/>
                 <w:webHidden/>
               </w:rPr>
-              <w:instrText xml:space="preserve"> PAGEREF _Toc218768182 \h </w:instrText>
+              <w:instrText xml:space="preserve"> PAGEREF _Toc219808048 \h </w:instrText>
             </w:r>
             <w:r>
               <w:rPr>
@@ -2567,7 +2567,7 @@
               <w:lang w:val="en-GB" w:eastAsia="en-GB"/>
             </w:rPr>
           </w:pPr>
-          <w:hyperlink w:anchor="_Toc218768183" w:history="1">
+          <w:hyperlink w:anchor="_Toc219808049" w:history="1">
             <w:r>
               <w:rPr>
                 <w:rStyle w:val="Hyperlink"/>
@@ -2594,7 +2594,7 @@
                 <w:noProof/>
                 <w:webHidden/>
               </w:rPr>
-              <w:instrText xml:space="preserve"> PAGEREF _Toc218768183 \h </w:instrText>
+              <w:instrText xml:space="preserve"> PAGEREF _Toc219808049 \h </w:instrText>
             </w:r>
             <w:r>
               <w:rPr>
@@ -2636,7 +2636,7 @@
               <w:lang w:val="en-GB" w:eastAsia="en-GB"/>
             </w:rPr>
           </w:pPr>
-          <w:hyperlink w:anchor="_Toc218768184" w:history="1">
+          <w:hyperlink w:anchor="_Toc219808050" w:history="1">
             <w:r>
               <w:rPr>
                 <w:rStyle w:val="Hyperlink"/>
@@ -2663,7 +2663,7 @@
                 <w:noProof/>
                 <w:webHidden/>
               </w:rPr>
-              <w:instrText xml:space="preserve"> PAGEREF _Toc218768184 \h </w:instrText>
+              <w:instrText xml:space="preserve"> PAGEREF _Toc219808050 \h </w:instrText>
             </w:r>
             <w:r>
               <w:rPr>
@@ -2705,7 +2705,7 @@
               <w:lang w:val="en-GB" w:eastAsia="en-GB"/>
             </w:rPr>
           </w:pPr>
-          <w:hyperlink w:anchor="_Toc218768185" w:history="1">
+          <w:hyperlink w:anchor="_Toc219808051" w:history="1">
             <w:r>
               <w:rPr>
                 <w:rStyle w:val="Hyperlink"/>
@@ -2732,7 +2732,7 @@
                 <w:noProof/>
                 <w:webHidden/>
               </w:rPr>
-              <w:instrText xml:space="preserve"> PAGEREF _Toc218768185 \h </w:instrText>
+              <w:instrText xml:space="preserve"> PAGEREF _Toc219808051 \h </w:instrText>
             </w:r>
             <w:r>
               <w:rPr>
@@ -2774,7 +2774,7 @@
               <w:lang w:val="en-GB" w:eastAsia="en-GB"/>
             </w:rPr>
           </w:pPr>
-          <w:hyperlink w:anchor="_Toc218768186" w:history="1">
+          <w:hyperlink w:anchor="_Toc219808052" w:history="1">
             <w:r>
               <w:rPr>
                 <w:rStyle w:val="Hyperlink"/>
@@ -2801,7 +2801,7 @@
                 <w:noProof/>
                 <w:webHidden/>
               </w:rPr>
-              <w:instrText xml:space="preserve"> PAGEREF _Toc218768186 \h </w:instrText>
+              <w:instrText xml:space="preserve"> PAGEREF _Toc219808052 \h </w:instrText>
             </w:r>
             <w:r>
               <w:rPr>
@@ -2843,7 +2843,7 @@
               <w:lang w:val="en-GB" w:eastAsia="en-GB"/>
             </w:rPr>
           </w:pPr>
-          <w:hyperlink w:anchor="_Toc218768187" w:history="1">
+          <w:hyperlink w:anchor="_Toc219808053" w:history="1">
             <w:r>
               <w:rPr>
                 <w:rStyle w:val="Hyperlink"/>
@@ -2885,7 +2885,7 @@
                 <w:noProof/>
                 <w:webHidden/>
               </w:rPr>
-              <w:instrText xml:space="preserve"> PAGEREF _Toc218768187 \h </w:instrText>
+              <w:instrText xml:space="preserve"> PAGEREF _Toc219808053 \h </w:instrText>
             </w:r>
             <w:r>
               <w:rPr>
@@ -2927,7 +2927,7 @@
               <w:lang w:val="en-GB" w:eastAsia="en-GB"/>
             </w:rPr>
           </w:pPr>
-          <w:hyperlink w:anchor="_Toc218768188" w:history="1">
+          <w:hyperlink w:anchor="_Toc219808054" w:history="1">
             <w:r>
               <w:rPr>
                 <w:rStyle w:val="Hyperlink"/>
@@ -2954,7 +2954,7 @@
                 <w:noProof/>
                 <w:webHidden/>
               </w:rPr>
-              <w:instrText xml:space="preserve"> PAGEREF _Toc218768188 \h </w:instrText>
+              <w:instrText xml:space="preserve"> PAGEREF _Toc219808054 \h </w:instrText>
             </w:r>
             <w:r>
               <w:rPr>
@@ -2996,7 +2996,7 @@
               <w:lang w:val="en-GB" w:eastAsia="en-GB"/>
             </w:rPr>
           </w:pPr>
-          <w:hyperlink w:anchor="_Toc218768189" w:history="1">
+          <w:hyperlink w:anchor="_Toc219808055" w:history="1">
             <w:r>
               <w:rPr>
                 <w:rStyle w:val="Hyperlink"/>
@@ -3023,7 +3023,7 @@
                 <w:noProof/>
                 <w:webHidden/>
               </w:rPr>
-              <w:instrText xml:space="preserve"> PAGEREF _Toc218768189 \h </w:instrText>
+              <w:instrText xml:space="preserve"> PAGEREF _Toc219808055 \h </w:instrText>
             </w:r>
             <w:r>
               <w:rPr>
@@ -3065,7 +3065,7 @@
               <w:lang w:val="en-GB" w:eastAsia="en-GB"/>
             </w:rPr>
           </w:pPr>
-          <w:hyperlink w:anchor="_Toc218768190" w:history="1">
+          <w:hyperlink w:anchor="_Toc219808056" w:history="1">
             <w:r>
               <w:rPr>
                 <w:rStyle w:val="Hyperlink"/>
@@ -3092,7 +3092,7 @@
                 <w:noProof/>
                 <w:webHidden/>
               </w:rPr>
-              <w:instrText xml:space="preserve"> PAGEREF _Toc218768190 \h </w:instrText>
+              <w:instrText xml:space="preserve"> PAGEREF _Toc219808056 \h </w:instrText>
             </w:r>
             <w:r>
               <w:rPr>
@@ -3134,7 +3134,7 @@
               <w:lang w:val="en-GB" w:eastAsia="en-GB"/>
             </w:rPr>
           </w:pPr>
-          <w:hyperlink w:anchor="_Toc218768191" w:history="1">
+          <w:hyperlink w:anchor="_Toc219808057" w:history="1">
             <w:r>
               <w:rPr>
                 <w:rStyle w:val="Hyperlink"/>
@@ -3161,7 +3161,7 @@
                 <w:noProof/>
                 <w:webHidden/>
               </w:rPr>
-              <w:instrText xml:space="preserve"> PAGEREF _Toc218768191 \h </w:instrText>
+              <w:instrText xml:space="preserve"> PAGEREF _Toc219808057 \h </w:instrText>
             </w:r>
             <w:r>
               <w:rPr>
@@ -3203,7 +3203,7 @@
               <w:lang w:val="en-GB" w:eastAsia="en-GB"/>
             </w:rPr>
           </w:pPr>
-          <w:hyperlink w:anchor="_Toc218768192" w:history="1">
+          <w:hyperlink w:anchor="_Toc219808058" w:history="1">
             <w:r>
               <w:rPr>
                 <w:rStyle w:val="Hyperlink"/>
@@ -3230,7 +3230,7 @@
                 <w:noProof/>
                 <w:webHidden/>
               </w:rPr>
-              <w:instrText xml:space="preserve"> PAGEREF _Toc218768192 \h </w:instrText>
+              <w:instrText xml:space="preserve"> PAGEREF _Toc219808058 \h </w:instrText>
             </w:r>
             <w:r>
               <w:rPr>
@@ -3272,7 +3272,7 @@
               <w:lang w:val="en-GB" w:eastAsia="en-GB"/>
             </w:rPr>
           </w:pPr>
-          <w:hyperlink w:anchor="_Toc218768193" w:history="1">
+          <w:hyperlink w:anchor="_Toc219808059" w:history="1">
             <w:r>
               <w:rPr>
                 <w:rStyle w:val="Hyperlink"/>
@@ -3299,7 +3299,7 @@
                 <w:noProof/>
                 <w:webHidden/>
               </w:rPr>
-              <w:instrText xml:space="preserve"> PAGEREF _Toc218768193 \h </w:instrText>
+              <w:instrText xml:space="preserve"> PAGEREF _Toc219808059 \h </w:instrText>
             </w:r>
             <w:r>
               <w:rPr>
@@ -3341,7 +3341,7 @@
               <w:lang w:val="en-GB" w:eastAsia="en-GB"/>
             </w:rPr>
           </w:pPr>
-          <w:hyperlink w:anchor="_Toc218768194" w:history="1">
+          <w:hyperlink w:anchor="_Toc219808060" w:history="1">
             <w:r>
               <w:rPr>
                 <w:rStyle w:val="Hyperlink"/>
@@ -3368,7 +3368,7 @@
                 <w:noProof/>
                 <w:webHidden/>
               </w:rPr>
-              <w:instrText xml:space="preserve"> PAGEREF _Toc218768194 \h </w:instrText>
+              <w:instrText xml:space="preserve"> PAGEREF _Toc219808060 \h </w:instrText>
             </w:r>
             <w:r>
               <w:rPr>
@@ -3410,7 +3410,7 @@
               <w:lang w:val="en-GB" w:eastAsia="en-GB"/>
             </w:rPr>
           </w:pPr>
-          <w:hyperlink w:anchor="_Toc218768195" w:history="1">
+          <w:hyperlink w:anchor="_Toc219808061" w:history="1">
             <w:r>
               <w:rPr>
                 <w:rStyle w:val="Hyperlink"/>
@@ -3445,7 +3445,7 @@
                 <w:noProof/>
                 <w:webHidden/>
               </w:rPr>
-              <w:instrText xml:space="preserve"> PAGEREF _Toc218768195 \h </w:instrText>
+              <w:instrText xml:space="preserve"> PAGEREF _Toc219808061 \h </w:instrText>
             </w:r>
             <w:r>
               <w:rPr>
@@ -3487,7 +3487,7 @@
               <w:lang w:val="en-GB" w:eastAsia="en-GB"/>
             </w:rPr>
           </w:pPr>
-          <w:hyperlink w:anchor="_Toc218768196" w:history="1">
+          <w:hyperlink w:anchor="_Toc219808062" w:history="1">
             <w:r>
               <w:rPr>
                 <w:rStyle w:val="Hyperlink"/>
@@ -3529,7 +3529,7 @@
                 <w:noProof/>
                 <w:webHidden/>
               </w:rPr>
-              <w:instrText xml:space="preserve"> PAGEREF _Toc218768196 \h </w:instrText>
+              <w:instrText xml:space="preserve"> PAGEREF _Toc219808062 \h </w:instrText>
             </w:r>
             <w:r>
               <w:rPr>
@@ -3571,7 +3571,7 @@
               <w:lang w:val="en-GB" w:eastAsia="en-GB"/>
             </w:rPr>
           </w:pPr>
-          <w:hyperlink w:anchor="_Toc218768197" w:history="1">
+          <w:hyperlink w:anchor="_Toc219808063" w:history="1">
             <w:r>
               <w:rPr>
                 <w:rStyle w:val="Hyperlink"/>
@@ -3598,7 +3598,7 @@
                 <w:noProof/>
                 <w:webHidden/>
               </w:rPr>
-              <w:instrText xml:space="preserve"> PAGEREF _Toc218768197 \h </w:instrText>
+              <w:instrText xml:space="preserve"> PAGEREF _Toc219808063 \h </w:instrText>
             </w:r>
             <w:r>
               <w:rPr>
@@ -3640,7 +3640,7 @@
               <w:lang w:val="en-GB" w:eastAsia="en-GB"/>
             </w:rPr>
           </w:pPr>
-          <w:hyperlink w:anchor="_Toc218768198" w:history="1">
+          <w:hyperlink w:anchor="_Toc219808064" w:history="1">
             <w:r>
               <w:rPr>
                 <w:rStyle w:val="Hyperlink"/>
@@ -3682,7 +3682,7 @@
                 <w:noProof/>
                 <w:webHidden/>
               </w:rPr>
-              <w:instrText xml:space="preserve"> PAGEREF _Toc218768198 \h </w:instrText>
+              <w:instrText xml:space="preserve"> PAGEREF _Toc219808064 \h </w:instrText>
             </w:r>
             <w:r>
               <w:rPr>
@@ -3724,7 +3724,7 @@
               <w:lang w:val="en-GB" w:eastAsia="en-GB"/>
             </w:rPr>
           </w:pPr>
-          <w:hyperlink w:anchor="_Toc218768199" w:history="1">
+          <w:hyperlink w:anchor="_Toc219808065" w:history="1">
             <w:r>
               <w:rPr>
                 <w:rStyle w:val="Hyperlink"/>
@@ -3766,7 +3766,7 @@
                 <w:noProof/>
                 <w:webHidden/>
               </w:rPr>
-              <w:instrText xml:space="preserve"> PAGEREF _Toc218768199 \h </w:instrText>
+              <w:instrText xml:space="preserve"> PAGEREF _Toc219808065 \h </w:instrText>
             </w:r>
             <w:r>
               <w:rPr>
@@ -3808,7 +3808,7 @@
               <w:lang w:val="en-GB" w:eastAsia="en-GB"/>
             </w:rPr>
           </w:pPr>
-          <w:hyperlink w:anchor="_Toc218768200" w:history="1">
+          <w:hyperlink w:anchor="_Toc219808066" w:history="1">
             <w:r>
               <w:rPr>
                 <w:rStyle w:val="Hyperlink"/>
@@ -3850,7 +3850,7 @@
                 <w:noProof/>
                 <w:webHidden/>
               </w:rPr>
-              <w:instrText xml:space="preserve"> PAGEREF _Toc218768200 \h </w:instrText>
+              <w:instrText xml:space="preserve"> PAGEREF _Toc219808066 \h </w:instrText>
             </w:r>
             <w:r>
               <w:rPr>
@@ -3892,7 +3892,7 @@
               <w:lang w:val="en-GB" w:eastAsia="en-GB"/>
             </w:rPr>
           </w:pPr>
-          <w:hyperlink w:anchor="_Toc218768201" w:history="1">
+          <w:hyperlink w:anchor="_Toc219808067" w:history="1">
             <w:r>
               <w:rPr>
                 <w:rStyle w:val="Hyperlink"/>
@@ -3927,7 +3927,7 @@
                 <w:noProof/>
                 <w:webHidden/>
               </w:rPr>
-              <w:instrText xml:space="preserve"> PAGEREF _Toc218768201 \h </w:instrText>
+              <w:instrText xml:space="preserve"> PAGEREF _Toc219808067 \h </w:instrText>
             </w:r>
             <w:r>
               <w:rPr>
@@ -3969,7 +3969,7 @@
               <w:lang w:val="en-GB" w:eastAsia="en-GB"/>
             </w:rPr>
           </w:pPr>
-          <w:hyperlink w:anchor="_Toc218768202" w:history="1">
+          <w:hyperlink w:anchor="_Toc219808068" w:history="1">
             <w:r>
               <w:rPr>
                 <w:rStyle w:val="Hyperlink"/>
@@ -4004,7 +4004,7 @@
                 <w:noProof/>
                 <w:webHidden/>
               </w:rPr>
-              <w:instrText xml:space="preserve"> PAGEREF _Toc218768202 \h </w:instrText>
+              <w:instrText xml:space="preserve"> PAGEREF _Toc219808068 \h </w:instrText>
             </w:r>
             <w:r>
               <w:rPr>
@@ -4046,7 +4046,7 @@
               <w:lang w:val="en-GB" w:eastAsia="en-GB"/>
             </w:rPr>
           </w:pPr>
-          <w:hyperlink w:anchor="_Toc218768203" w:history="1">
+          <w:hyperlink w:anchor="_Toc219808069" w:history="1">
             <w:r>
               <w:rPr>
                 <w:rStyle w:val="Hyperlink"/>
@@ -4081,7 +4081,7 @@
                 <w:noProof/>
                 <w:webHidden/>
               </w:rPr>
-              <w:instrText xml:space="preserve"> PAGEREF _Toc218768203 \h </w:instrText>
+              <w:instrText xml:space="preserve"> PAGEREF _Toc219808069 \h </w:instrText>
             </w:r>
             <w:r>
               <w:rPr>
@@ -4123,7 +4123,7 @@
               <w:lang w:val="en-GB" w:eastAsia="en-GB"/>
             </w:rPr>
           </w:pPr>
-          <w:hyperlink w:anchor="_Toc218768204" w:history="1">
+          <w:hyperlink w:anchor="_Toc219808070" w:history="1">
             <w:r>
               <w:rPr>
                 <w:rStyle w:val="Hyperlink"/>
@@ -4158,7 +4158,7 @@
                 <w:noProof/>
                 <w:webHidden/>
               </w:rPr>
-              <w:instrText xml:space="preserve"> PAGEREF _Toc218768204 \h </w:instrText>
+              <w:instrText xml:space="preserve"> PAGEREF _Toc219808070 \h </w:instrText>
             </w:r>
             <w:r>
               <w:rPr>
@@ -4200,7 +4200,7 @@
               <w:lang w:val="en-GB" w:eastAsia="en-GB"/>
             </w:rPr>
           </w:pPr>
-          <w:hyperlink w:anchor="_Toc218768205" w:history="1">
+          <w:hyperlink w:anchor="_Toc219808071" w:history="1">
             <w:r>
               <w:rPr>
                 <w:rStyle w:val="Hyperlink"/>
@@ -4227,7 +4227,7 @@
                 <w:noProof/>
                 <w:webHidden/>
               </w:rPr>
-              <w:instrText xml:space="preserve"> PAGEREF _Toc218768205 \h </w:instrText>
+              <w:instrText xml:space="preserve"> PAGEREF _Toc219808071 \h </w:instrText>
             </w:r>
             <w:r>
               <w:rPr>
@@ -4269,7 +4269,7 @@
               <w:lang w:val="en-GB" w:eastAsia="en-GB"/>
             </w:rPr>
           </w:pPr>
-          <w:hyperlink w:anchor="_Toc218768206" w:history="1">
+          <w:hyperlink w:anchor="_Toc219808072" w:history="1">
             <w:r>
               <w:rPr>
                 <w:rStyle w:val="Hyperlink"/>
@@ -4311,7 +4311,7 @@
                 <w:noProof/>
                 <w:webHidden/>
               </w:rPr>
-              <w:instrText xml:space="preserve"> PAGEREF _Toc218768206 \h </w:instrText>
+              <w:instrText xml:space="preserve"> PAGEREF _Toc219808072 \h </w:instrText>
             </w:r>
             <w:r>
               <w:rPr>
@@ -4353,7 +4353,7 @@
               <w:lang w:val="en-GB" w:eastAsia="en-GB"/>
             </w:rPr>
           </w:pPr>
-          <w:hyperlink w:anchor="_Toc218768207" w:history="1">
+          <w:hyperlink w:anchor="_Toc219808073" w:history="1">
             <w:r>
               <w:rPr>
                 <w:rStyle w:val="Hyperlink"/>
@@ -4380,7 +4380,7 @@
                 <w:noProof/>
                 <w:webHidden/>
               </w:rPr>
-              <w:instrText xml:space="preserve"> PAGEREF _Toc218768207 \h </w:instrText>
+              <w:instrText xml:space="preserve"> PAGEREF _Toc219808073 \h </w:instrText>
             </w:r>
             <w:r>
               <w:rPr>
@@ -4422,7 +4422,7 @@
               <w:lang w:val="en-GB" w:eastAsia="en-GB"/>
             </w:rPr>
           </w:pPr>
-          <w:hyperlink w:anchor="_Toc218768208" w:history="1">
+          <w:hyperlink w:anchor="_Toc219808074" w:history="1">
             <w:r>
               <w:rPr>
                 <w:rStyle w:val="Hyperlink"/>
@@ -4449,7 +4449,7 @@
                 <w:noProof/>
                 <w:webHidden/>
               </w:rPr>
-              <w:instrText xml:space="preserve"> PAGEREF _Toc218768208 \h </w:instrText>
+              <w:instrText xml:space="preserve"> PAGEREF _Toc219808074 \h </w:instrText>
             </w:r>
             <w:r>
               <w:rPr>
@@ -4491,7 +4491,7 @@
               <w:lang w:val="en-GB" w:eastAsia="en-GB"/>
             </w:rPr>
           </w:pPr>
-          <w:hyperlink w:anchor="_Toc218768209" w:history="1">
+          <w:hyperlink w:anchor="_Toc219808075" w:history="1">
             <w:r>
               <w:rPr>
                 <w:rStyle w:val="Hyperlink"/>
@@ -4518,7 +4518,7 @@
                 <w:noProof/>
                 <w:webHidden/>
               </w:rPr>
-              <w:instrText xml:space="preserve"> PAGEREF _Toc218768209 \h </w:instrText>
+              <w:instrText xml:space="preserve"> PAGEREF _Toc219808075 \h </w:instrText>
             </w:r>
             <w:r>
               <w:rPr>
@@ -4560,7 +4560,7 @@
               <w:lang w:val="en-GB" w:eastAsia="en-GB"/>
             </w:rPr>
           </w:pPr>
-          <w:hyperlink w:anchor="_Toc218768210" w:history="1">
+          <w:hyperlink w:anchor="_Toc219808076" w:history="1">
             <w:r>
               <w:rPr>
                 <w:rStyle w:val="Hyperlink"/>
@@ -4587,7 +4587,7 @@
                 <w:noProof/>
                 <w:webHidden/>
               </w:rPr>
-              <w:instrText xml:space="preserve"> PAGEREF _Toc218768210 \h </w:instrText>
+              <w:instrText xml:space="preserve"> PAGEREF _Toc219808076 \h </w:instrText>
             </w:r>
             <w:r>
               <w:rPr>
@@ -4629,7 +4629,7 @@
               <w:lang w:val="en-GB" w:eastAsia="en-GB"/>
             </w:rPr>
           </w:pPr>
-          <w:hyperlink w:anchor="_Toc218768211" w:history="1">
+          <w:hyperlink w:anchor="_Toc219808077" w:history="1">
             <w:r>
               <w:rPr>
                 <w:rStyle w:val="Hyperlink"/>
@@ -4656,7 +4656,7 @@
                 <w:noProof/>
                 <w:webHidden/>
               </w:rPr>
-              <w:instrText xml:space="preserve"> PAGEREF _Toc218768211 \h </w:instrText>
+              <w:instrText xml:space="preserve"> PAGEREF _Toc219808077 \h </w:instrText>
             </w:r>
             <w:r>
               <w:rPr>
@@ -4698,7 +4698,7 @@
               <w:lang w:val="en-GB" w:eastAsia="en-GB"/>
             </w:rPr>
           </w:pPr>
-          <w:hyperlink w:anchor="_Toc218768212" w:history="1">
+          <w:hyperlink w:anchor="_Toc219808078" w:history="1">
             <w:r>
               <w:rPr>
                 <w:rStyle w:val="Hyperlink"/>
@@ -4725,7 +4725,7 @@
                 <w:noProof/>
                 <w:webHidden/>
               </w:rPr>
-              <w:instrText xml:space="preserve"> PAGEREF _Toc218768212 \h </w:instrText>
+              <w:instrText xml:space="preserve"> PAGEREF _Toc219808078 \h </w:instrText>
             </w:r>
             <w:r>
               <w:rPr>
@@ -4767,7 +4767,7 @@
               <w:lang w:val="en-GB" w:eastAsia="en-GB"/>
             </w:rPr>
           </w:pPr>
-          <w:hyperlink w:anchor="_Toc218768213" w:history="1">
+          <w:hyperlink w:anchor="_Toc219808079" w:history="1">
             <w:r>
               <w:rPr>
                 <w:rStyle w:val="Hyperlink"/>
@@ -4794,7 +4794,7 @@
                 <w:noProof/>
                 <w:webHidden/>
               </w:rPr>
-              <w:instrText xml:space="preserve"> PAGEREF _Toc218768213 \h </w:instrText>
+              <w:instrText xml:space="preserve"> PAGEREF _Toc219808079 \h </w:instrText>
             </w:r>
             <w:r>
               <w:rPr>
@@ -4836,7 +4836,7 @@
               <w:lang w:val="en-GB" w:eastAsia="en-GB"/>
             </w:rPr>
           </w:pPr>
-          <w:hyperlink w:anchor="_Toc218768214" w:history="1">
+          <w:hyperlink w:anchor="_Toc219808080" w:history="1">
             <w:r>
               <w:rPr>
                 <w:rStyle w:val="Hyperlink"/>
@@ -4863,7 +4863,7 @@
                 <w:noProof/>
                 <w:webHidden/>
               </w:rPr>
-              <w:instrText xml:space="preserve"> PAGEREF _Toc218768214 \h </w:instrText>
+              <w:instrText xml:space="preserve"> PAGEREF _Toc219808080 \h </w:instrText>
             </w:r>
             <w:r>
               <w:rPr>
@@ -4905,7 +4905,7 @@
               <w:lang w:val="en-GB" w:eastAsia="en-GB"/>
             </w:rPr>
           </w:pPr>
-          <w:hyperlink w:anchor="_Toc218768215" w:history="1">
+          <w:hyperlink w:anchor="_Toc219808081" w:history="1">
             <w:r>
               <w:rPr>
                 <w:rStyle w:val="Hyperlink"/>
@@ -4932,7 +4932,7 @@
                 <w:noProof/>
                 <w:webHidden/>
               </w:rPr>
-              <w:instrText xml:space="preserve"> PAGEREF _Toc218768215 \h </w:instrText>
+              <w:instrText xml:space="preserve"> PAGEREF _Toc219808081 \h </w:instrText>
             </w:r>
             <w:r>
               <w:rPr>
@@ -4974,7 +4974,7 @@
               <w:lang w:val="en-GB" w:eastAsia="en-GB"/>
             </w:rPr>
           </w:pPr>
-          <w:hyperlink w:anchor="_Toc218768216" w:history="1">
+          <w:hyperlink w:anchor="_Toc219808082" w:history="1">
             <w:r>
               <w:rPr>
                 <w:rStyle w:val="Hyperlink"/>
@@ -5001,7 +5001,7 @@
                 <w:noProof/>
                 <w:webHidden/>
               </w:rPr>
-              <w:instrText xml:space="preserve"> PAGEREF _Toc218768216 \h </w:instrText>
+              <w:instrText xml:space="preserve"> PAGEREF _Toc219808082 \h </w:instrText>
             </w:r>
             <w:r>
               <w:rPr>
@@ -5043,7 +5043,7 @@
               <w:lang w:val="en-GB" w:eastAsia="en-GB"/>
             </w:rPr>
           </w:pPr>
-          <w:hyperlink w:anchor="_Toc218768217" w:history="1">
+          <w:hyperlink w:anchor="_Toc219808083" w:history="1">
             <w:r>
               <w:rPr>
                 <w:rStyle w:val="Hyperlink"/>
@@ -5070,7 +5070,7 @@
                 <w:noProof/>
                 <w:webHidden/>
               </w:rPr>
-              <w:instrText xml:space="preserve"> PAGEREF _Toc218768217 \h </w:instrText>
+              <w:instrText xml:space="preserve"> PAGEREF _Toc219808083 \h </w:instrText>
             </w:r>
             <w:r>
               <w:rPr>
@@ -5112,7 +5112,7 @@
               <w:lang w:val="en-GB" w:eastAsia="en-GB"/>
             </w:rPr>
           </w:pPr>
-          <w:hyperlink w:anchor="_Toc218768218" w:history="1">
+          <w:hyperlink w:anchor="_Toc219808084" w:history="1">
             <w:r>
               <w:rPr>
                 <w:rStyle w:val="Hyperlink"/>
@@ -5139,7 +5139,7 @@
                 <w:noProof/>
                 <w:webHidden/>
               </w:rPr>
-              <w:instrText xml:space="preserve"> PAGEREF _Toc218768218 \h </w:instrText>
+              <w:instrText xml:space="preserve"> PAGEREF _Toc219808084 \h </w:instrText>
             </w:r>
             <w:r>
               <w:rPr>
@@ -5181,7 +5181,7 @@
               <w:lang w:val="en-GB" w:eastAsia="en-GB"/>
             </w:rPr>
           </w:pPr>
-          <w:hyperlink w:anchor="_Toc218768219" w:history="1">
+          <w:hyperlink w:anchor="_Toc219808085" w:history="1">
             <w:r>
               <w:rPr>
                 <w:rStyle w:val="Hyperlink"/>
@@ -5208,7 +5208,7 @@
                 <w:noProof/>
                 <w:webHidden/>
               </w:rPr>
-              <w:instrText xml:space="preserve"> PAGEREF _Toc218768219 \h </w:instrText>
+              <w:instrText xml:space="preserve"> PAGEREF _Toc219808085 \h </w:instrText>
             </w:r>
             <w:r>
               <w:rPr>
@@ -5250,7 +5250,7 @@
               <w:lang w:val="en-GB" w:eastAsia="en-GB"/>
             </w:rPr>
           </w:pPr>
-          <w:hyperlink w:anchor="_Toc218768220" w:history="1">
+          <w:hyperlink w:anchor="_Toc219808086" w:history="1">
             <w:r>
               <w:rPr>
                 <w:rStyle w:val="Hyperlink"/>
@@ -5277,7 +5277,7 @@
                 <w:noProof/>
                 <w:webHidden/>
               </w:rPr>
-              <w:instrText xml:space="preserve"> PAGEREF _Toc218768220 \h </w:instrText>
+              <w:instrText xml:space="preserve"> PAGEREF _Toc219808086 \h </w:instrText>
             </w:r>
             <w:r>
               <w:rPr>
@@ -5319,7 +5319,7 @@
               <w:lang w:val="en-GB" w:eastAsia="en-GB"/>
             </w:rPr>
           </w:pPr>
-          <w:hyperlink w:anchor="_Toc218768221" w:history="1">
+          <w:hyperlink w:anchor="_Toc219808087" w:history="1">
             <w:r>
               <w:rPr>
                 <w:rStyle w:val="Hyperlink"/>
@@ -5346,7 +5346,7 @@
                 <w:noProof/>
                 <w:webHidden/>
               </w:rPr>
-              <w:instrText xml:space="preserve"> PAGEREF _Toc218768221 \h </w:instrText>
+              <w:instrText xml:space="preserve"> PAGEREF _Toc219808087 \h </w:instrText>
             </w:r>
             <w:r>
               <w:rPr>
@@ -5388,7 +5388,7 @@
               <w:lang w:val="en-GB" w:eastAsia="en-GB"/>
             </w:rPr>
           </w:pPr>
-          <w:hyperlink w:anchor="_Toc218768222" w:history="1">
+          <w:hyperlink w:anchor="_Toc219808088" w:history="1">
             <w:r>
               <w:rPr>
                 <w:rStyle w:val="Hyperlink"/>
@@ -5415,7 +5415,7 @@
                 <w:noProof/>
                 <w:webHidden/>
               </w:rPr>
-              <w:instrText xml:space="preserve"> PAGEREF _Toc218768222 \h </w:instrText>
+              <w:instrText xml:space="preserve"> PAGEREF _Toc219808088 \h </w:instrText>
             </w:r>
             <w:r>
               <w:rPr>
@@ -5457,7 +5457,7 @@
               <w:lang w:val="en-GB" w:eastAsia="en-GB"/>
             </w:rPr>
           </w:pPr>
-          <w:hyperlink w:anchor="_Toc218768223" w:history="1">
+          <w:hyperlink w:anchor="_Toc219808089" w:history="1">
             <w:r>
               <w:rPr>
                 <w:rStyle w:val="Hyperlink"/>
@@ -5484,7 +5484,7 @@
                 <w:noProof/>
                 <w:webHidden/>
               </w:rPr>
-              <w:instrText xml:space="preserve"> PAGEREF _Toc218768223 \h </w:instrText>
+              <w:instrText xml:space="preserve"> PAGEREF _Toc219808089 \h </w:instrText>
             </w:r>
             <w:r>
               <w:rPr>
@@ -5526,7 +5526,7 @@
               <w:lang w:val="en-GB" w:eastAsia="en-GB"/>
             </w:rPr>
           </w:pPr>
-          <w:hyperlink w:anchor="_Toc218768224" w:history="1">
+          <w:hyperlink w:anchor="_Toc219808090" w:history="1">
             <w:r>
               <w:rPr>
                 <w:rStyle w:val="Hyperlink"/>
@@ -5553,7 +5553,7 @@
                 <w:noProof/>
                 <w:webHidden/>
               </w:rPr>
-              <w:instrText xml:space="preserve"> PAGEREF _Toc218768224 \h </w:instrText>
+              <w:instrText xml:space="preserve"> PAGEREF _Toc219808090 \h </w:instrText>
             </w:r>
             <w:r>
               <w:rPr>
@@ -5595,7 +5595,7 @@
               <w:lang w:val="en-GB" w:eastAsia="en-GB"/>
             </w:rPr>
           </w:pPr>
-          <w:hyperlink w:anchor="_Toc218768225" w:history="1">
+          <w:hyperlink w:anchor="_Toc219808091" w:history="1">
             <w:r>
               <w:rPr>
                 <w:rStyle w:val="Hyperlink"/>
@@ -5622,7 +5622,7 @@
                 <w:noProof/>
                 <w:webHidden/>
               </w:rPr>
-              <w:instrText xml:space="preserve"> PAGEREF _Toc218768225 \h </w:instrText>
+              <w:instrText xml:space="preserve"> PAGEREF _Toc219808091 \h </w:instrText>
             </w:r>
             <w:r>
               <w:rPr>
@@ -5664,7 +5664,7 @@
               <w:lang w:val="en-GB" w:eastAsia="en-GB"/>
             </w:rPr>
           </w:pPr>
-          <w:hyperlink w:anchor="_Toc218768226" w:history="1">
+          <w:hyperlink w:anchor="_Toc219808092" w:history="1">
             <w:r>
               <w:rPr>
                 <w:rStyle w:val="Hyperlink"/>
@@ -5691,7 +5691,7 @@
                 <w:noProof/>
                 <w:webHidden/>
               </w:rPr>
-              <w:instrText xml:space="preserve"> PAGEREF _Toc218768226 \h </w:instrText>
+              <w:instrText xml:space="preserve"> PAGEREF _Toc219808092 \h </w:instrText>
             </w:r>
             <w:r>
               <w:rPr>
@@ -5733,7 +5733,7 @@
               <w:lang w:val="en-GB" w:eastAsia="en-GB"/>
             </w:rPr>
           </w:pPr>
-          <w:hyperlink w:anchor="_Toc218768227" w:history="1">
+          <w:hyperlink w:anchor="_Toc219808093" w:history="1">
             <w:r>
               <w:rPr>
                 <w:rStyle w:val="Hyperlink"/>
@@ -5760,7 +5760,7 @@
                 <w:noProof/>
                 <w:webHidden/>
               </w:rPr>
-              <w:instrText xml:space="preserve"> PAGEREF _Toc218768227 \h </w:instrText>
+              <w:instrText xml:space="preserve"> PAGEREF _Toc219808093 \h </w:instrText>
             </w:r>
             <w:r>
               <w:rPr>
@@ -5802,7 +5802,7 @@
               <w:lang w:val="en-GB" w:eastAsia="en-GB"/>
             </w:rPr>
           </w:pPr>
-          <w:hyperlink w:anchor="_Toc218768228" w:history="1">
+          <w:hyperlink w:anchor="_Toc219808094" w:history="1">
             <w:r>
               <w:rPr>
                 <w:rStyle w:val="Hyperlink"/>
@@ -5829,7 +5829,7 @@
                 <w:noProof/>
                 <w:webHidden/>
               </w:rPr>
-              <w:instrText xml:space="preserve"> PAGEREF _Toc218768228 \h </w:instrText>
+              <w:instrText xml:space="preserve"> PAGEREF _Toc219808094 \h </w:instrText>
             </w:r>
             <w:r>
               <w:rPr>
@@ -5871,7 +5871,7 @@
               <w:lang w:val="en-GB" w:eastAsia="en-GB"/>
             </w:rPr>
           </w:pPr>
-          <w:hyperlink w:anchor="_Toc218768229" w:history="1">
+          <w:hyperlink w:anchor="_Toc219808095" w:history="1">
             <w:r>
               <w:rPr>
                 <w:rStyle w:val="Hyperlink"/>
@@ -5913,7 +5913,7 @@
                 <w:noProof/>
                 <w:webHidden/>
               </w:rPr>
-              <w:instrText xml:space="preserve"> PAGEREF _Toc218768229 \h </w:instrText>
+              <w:instrText xml:space="preserve"> PAGEREF _Toc219808095 \h </w:instrText>
             </w:r>
             <w:r>
               <w:rPr>
@@ -5955,7 +5955,7 @@
               <w:lang w:val="en-GB" w:eastAsia="en-GB"/>
             </w:rPr>
           </w:pPr>
-          <w:hyperlink w:anchor="_Toc218768230" w:history="1">
+          <w:hyperlink w:anchor="_Toc219808096" w:history="1">
             <w:r>
               <w:rPr>
                 <w:rStyle w:val="Hyperlink"/>
@@ -5982,7 +5982,7 @@
                 <w:noProof/>
                 <w:webHidden/>
               </w:rPr>
-              <w:instrText xml:space="preserve"> PAGEREF _Toc218768230 \h </w:instrText>
+              <w:instrText xml:space="preserve"> PAGEREF _Toc219808096 \h </w:instrText>
             </w:r>
             <w:r>
               <w:rPr>
@@ -6024,7 +6024,7 @@
               <w:lang w:val="en-GB" w:eastAsia="en-GB"/>
             </w:rPr>
           </w:pPr>
-          <w:hyperlink w:anchor="_Toc218768231" w:history="1">
+          <w:hyperlink w:anchor="_Toc219808097" w:history="1">
             <w:r>
               <w:rPr>
                 <w:rStyle w:val="Hyperlink"/>
@@ -6051,7 +6051,7 @@
                 <w:noProof/>
                 <w:webHidden/>
               </w:rPr>
-              <w:instrText xml:space="preserve"> PAGEREF _Toc218768231 \h </w:instrText>
+              <w:instrText xml:space="preserve"> PAGEREF _Toc219808097 \h </w:instrText>
             </w:r>
             <w:r>
               <w:rPr>
@@ -6072,6 +6072,282 @@
                 <w:webHidden/>
               </w:rPr>
               <w:t>32</w:t>
+            </w:r>
+            <w:r>
+              <w:rPr>
+                <w:noProof/>
+                <w:webHidden/>
+              </w:rPr>
+              <w:fldChar w:fldCharType="end"/>
+            </w:r>
+          </w:hyperlink>
+        </w:p>
+        <w:p>
+          <w:pPr>
+            <w:pStyle w:val="TOC1"/>
+            <w:tabs>
+              <w:tab w:val="right" w:leader="dot" w:pos="9912"/>
+            </w:tabs>
+            <w:rPr>
+              <w:noProof/>
+              <w:lang w:val="en-GB" w:eastAsia="en-GB"/>
+            </w:rPr>
+          </w:pPr>
+          <w:hyperlink w:anchor="_Toc219808098" w:history="1">
+            <w:r>
+              <w:rPr>
+                <w:rStyle w:val="Hyperlink"/>
+                <w:noProof/>
+              </w:rPr>
+              <w:t>DB Access</w:t>
+            </w:r>
+            <w:r>
+              <w:rPr>
+                <w:noProof/>
+                <w:webHidden/>
+              </w:rPr>
+              <w:tab/>
+            </w:r>
+            <w:r>
+              <w:rPr>
+                <w:noProof/>
+                <w:webHidden/>
+              </w:rPr>
+              <w:fldChar w:fldCharType="begin"/>
+            </w:r>
+            <w:r>
+              <w:rPr>
+                <w:noProof/>
+                <w:webHidden/>
+              </w:rPr>
+              <w:instrText xml:space="preserve"> PAGEREF _Toc219808098 \h </w:instrText>
+            </w:r>
+            <w:r>
+              <w:rPr>
+                <w:noProof/>
+                <w:webHidden/>
+              </w:rPr>
+            </w:r>
+            <w:r>
+              <w:rPr>
+                <w:noProof/>
+                <w:webHidden/>
+              </w:rPr>
+              <w:fldChar w:fldCharType="separate"/>
+            </w:r>
+            <w:r>
+              <w:rPr>
+                <w:noProof/>
+                <w:webHidden/>
+              </w:rPr>
+              <w:t>33</w:t>
+            </w:r>
+            <w:r>
+              <w:rPr>
+                <w:noProof/>
+                <w:webHidden/>
+              </w:rPr>
+              <w:fldChar w:fldCharType="end"/>
+            </w:r>
+          </w:hyperlink>
+        </w:p>
+        <w:p>
+          <w:pPr>
+            <w:pStyle w:val="TOC2"/>
+            <w:tabs>
+              <w:tab w:val="right" w:leader="dot" w:pos="9912"/>
+            </w:tabs>
+            <w:rPr>
+              <w:noProof/>
+              <w:lang w:val="en-GB" w:eastAsia="en-GB"/>
+            </w:rPr>
+          </w:pPr>
+          <w:hyperlink w:anchor="_Toc219808099" w:history="1">
+            <w:r>
+              <w:rPr>
+                <w:rStyle w:val="Hyperlink"/>
+                <w:noProof/>
+              </w:rPr>
+              <w:t>Layers in accessing a Database</w:t>
+            </w:r>
+            <w:r>
+              <w:rPr>
+                <w:noProof/>
+                <w:webHidden/>
+              </w:rPr>
+              <w:tab/>
+            </w:r>
+            <w:r>
+              <w:rPr>
+                <w:noProof/>
+                <w:webHidden/>
+              </w:rPr>
+              <w:fldChar w:fldCharType="begin"/>
+            </w:r>
+            <w:r>
+              <w:rPr>
+                <w:noProof/>
+                <w:webHidden/>
+              </w:rPr>
+              <w:instrText xml:space="preserve"> PAGEREF _Toc219808099 \h </w:instrText>
+            </w:r>
+            <w:r>
+              <w:rPr>
+                <w:noProof/>
+                <w:webHidden/>
+              </w:rPr>
+            </w:r>
+            <w:r>
+              <w:rPr>
+                <w:noProof/>
+                <w:webHidden/>
+              </w:rPr>
+              <w:fldChar w:fldCharType="separate"/>
+            </w:r>
+            <w:r>
+              <w:rPr>
+                <w:noProof/>
+                <w:webHidden/>
+              </w:rPr>
+              <w:t>33</w:t>
+            </w:r>
+            <w:r>
+              <w:rPr>
+                <w:noProof/>
+                <w:webHidden/>
+              </w:rPr>
+              <w:fldChar w:fldCharType="end"/>
+            </w:r>
+          </w:hyperlink>
+        </w:p>
+        <w:p>
+          <w:pPr>
+            <w:pStyle w:val="TOC2"/>
+            <w:tabs>
+              <w:tab w:val="right" w:leader="dot" w:pos="9912"/>
+            </w:tabs>
+            <w:rPr>
+              <w:noProof/>
+              <w:lang w:val="en-GB" w:eastAsia="en-GB"/>
+            </w:rPr>
+          </w:pPr>
+          <w:hyperlink w:anchor="_Toc219808100" w:history="1">
+            <w:r>
+              <w:rPr>
+                <w:rStyle w:val="Hyperlink"/>
+                <w:noProof/>
+              </w:rPr>
+              <w:t>Handle DB connection</w:t>
+            </w:r>
+            <w:r>
+              <w:rPr>
+                <w:noProof/>
+                <w:webHidden/>
+              </w:rPr>
+              <w:tab/>
+            </w:r>
+            <w:r>
+              <w:rPr>
+                <w:noProof/>
+                <w:webHidden/>
+              </w:rPr>
+              <w:fldChar w:fldCharType="begin"/>
+            </w:r>
+            <w:r>
+              <w:rPr>
+                <w:noProof/>
+                <w:webHidden/>
+              </w:rPr>
+              <w:instrText xml:space="preserve"> PAGEREF _Toc219808100 \h </w:instrText>
+            </w:r>
+            <w:r>
+              <w:rPr>
+                <w:noProof/>
+                <w:webHidden/>
+              </w:rPr>
+            </w:r>
+            <w:r>
+              <w:rPr>
+                <w:noProof/>
+                <w:webHidden/>
+              </w:rPr>
+              <w:fldChar w:fldCharType="separate"/>
+            </w:r>
+            <w:r>
+              <w:rPr>
+                <w:noProof/>
+                <w:webHidden/>
+              </w:rPr>
+              <w:t>33</w:t>
+            </w:r>
+            <w:r>
+              <w:rPr>
+                <w:noProof/>
+                <w:webHidden/>
+              </w:rPr>
+              <w:fldChar w:fldCharType="end"/>
+            </w:r>
+          </w:hyperlink>
+        </w:p>
+        <w:p>
+          <w:pPr>
+            <w:pStyle w:val="TOC2"/>
+            <w:tabs>
+              <w:tab w:val="right" w:leader="dot" w:pos="9912"/>
+            </w:tabs>
+            <w:rPr>
+              <w:noProof/>
+              <w:lang w:val="en-GB" w:eastAsia="en-GB"/>
+            </w:rPr>
+          </w:pPr>
+          <w:hyperlink w:anchor="_Toc219808101" w:history="1">
+            <w:r>
+              <w:rPr>
+                <w:rStyle w:val="Hyperlink"/>
+                <w:noProof/>
+              </w:rPr>
+              <w:t>Package Structure</w:t>
+            </w:r>
+            <w:r>
+              <w:rPr>
+                <w:noProof/>
+                <w:webHidden/>
+              </w:rPr>
+              <w:tab/>
+            </w:r>
+            <w:r>
+              <w:rPr>
+                <w:noProof/>
+                <w:webHidden/>
+              </w:rPr>
+              <w:fldChar w:fldCharType="begin"/>
+            </w:r>
+            <w:r>
+              <w:rPr>
+                <w:noProof/>
+                <w:webHidden/>
+              </w:rPr>
+              <w:instrText xml:space="preserve"> PAGEREF _Toc219808101 \h </w:instrText>
+            </w:r>
+            <w:r>
+              <w:rPr>
+                <w:noProof/>
+                <w:webHidden/>
+              </w:rPr>
+            </w:r>
+            <w:r>
+              <w:rPr>
+                <w:noProof/>
+                <w:webHidden/>
+              </w:rPr>
+              <w:fldChar w:fldCharType="separate"/>
+            </w:r>
+            <w:r>
+              <w:rPr>
+                <w:noProof/>
+                <w:webHidden/>
+              </w:rPr>
+              <w:t>33</w:t>
             </w:r>
             <w:r>
               <w:rPr>
@@ -6108,7 +6384,7 @@
       <w:pPr>
         <w:pStyle w:val="Heading1"/>
       </w:pPr>
-      <w:bookmarkStart w:id="0" w:name="_Toc218768149"/>
+      <w:bookmarkStart w:id="0" w:name="_Toc219808015"/>
       <w:r>
         <w:lastRenderedPageBreak/>
         <w:t>Topics to learn</w:t>
@@ -6120,7 +6396,7 @@
       <w:pPr>
         <w:pStyle w:val="Heading2"/>
       </w:pPr>
-      <w:bookmarkStart w:id="1" w:name="_Toc218768150"/>
+      <w:bookmarkStart w:id="1" w:name="_Toc219808016"/>
       <w:r>
         <w:t>1</w:t>
       </w:r>
@@ -6212,7 +6488,7 @@
       <w:pPr>
         <w:pStyle w:val="Heading2"/>
       </w:pPr>
-      <w:bookmarkStart w:id="2" w:name="_Toc218768151"/>
+      <w:bookmarkStart w:id="2" w:name="_Toc219808017"/>
       <w:r>
         <w:t>2</w:t>
       </w:r>
@@ -6332,7 +6608,7 @@
       <w:pPr>
         <w:pStyle w:val="Heading2"/>
       </w:pPr>
-      <w:bookmarkStart w:id="3" w:name="_Toc218768152"/>
+      <w:bookmarkStart w:id="3" w:name="_Toc219808018"/>
       <w:r>
         <w:t xml:space="preserve">3. </w:t>
       </w:r>
@@ -6416,7 +6692,7 @@
       <w:pPr>
         <w:pStyle w:val="Heading2"/>
       </w:pPr>
-      <w:bookmarkStart w:id="4" w:name="_Toc218768153"/>
+      <w:bookmarkStart w:id="4" w:name="_Toc219808019"/>
       <w:r>
         <w:t>4</w:t>
       </w:r>
@@ -6582,7 +6858,7 @@
       <w:pPr>
         <w:pStyle w:val="Heading2"/>
       </w:pPr>
-      <w:bookmarkStart w:id="5" w:name="_Toc218768154"/>
+      <w:bookmarkStart w:id="5" w:name="_Toc219808020"/>
       <w:r>
         <w:t xml:space="preserve">5. </w:t>
       </w:r>
@@ -6735,7 +7011,7 @@
       <w:pPr>
         <w:pStyle w:val="Heading2"/>
       </w:pPr>
-      <w:bookmarkStart w:id="6" w:name="_Toc218768155"/>
+      <w:bookmarkStart w:id="6" w:name="_Toc219808021"/>
       <w:r>
         <w:t>6</w:t>
       </w:r>
@@ -6839,7 +7115,7 @@
       <w:pPr>
         <w:pStyle w:val="Heading2"/>
       </w:pPr>
-      <w:bookmarkStart w:id="7" w:name="_Toc218768156"/>
+      <w:bookmarkStart w:id="7" w:name="_Toc219808022"/>
       <w:r>
         <w:t>7</w:t>
       </w:r>
@@ -6977,7 +7253,7 @@
       <w:pPr>
         <w:pStyle w:val="Heading2"/>
       </w:pPr>
-      <w:bookmarkStart w:id="8" w:name="_Toc218768157"/>
+      <w:bookmarkStart w:id="8" w:name="_Toc219808023"/>
       <w:r>
         <w:t>8</w:t>
       </w:r>
@@ -7124,7 +7400,7 @@
       <w:pPr>
         <w:pStyle w:val="Heading2"/>
       </w:pPr>
-      <w:bookmarkStart w:id="9" w:name="_Toc218768158"/>
+      <w:bookmarkStart w:id="9" w:name="_Toc219808024"/>
       <w:r>
         <w:t>9</w:t>
       </w:r>
@@ -7230,7 +7506,7 @@
       <w:pPr>
         <w:pStyle w:val="Heading2"/>
       </w:pPr>
-      <w:bookmarkStart w:id="10" w:name="_Toc218768159"/>
+      <w:bookmarkStart w:id="10" w:name="_Toc219808025"/>
       <w:r>
         <w:t>10</w:t>
       </w:r>
@@ -7368,7 +7644,7 @@
       <w:pPr>
         <w:pStyle w:val="Heading2"/>
       </w:pPr>
-      <w:bookmarkStart w:id="11" w:name="_Toc218768160"/>
+      <w:bookmarkStart w:id="11" w:name="_Toc219808026"/>
       <w:r>
         <w:lastRenderedPageBreak/>
         <w:t>11</w:t>
@@ -7466,7 +7742,7 @@
       <w:pPr>
         <w:pStyle w:val="Heading2"/>
       </w:pPr>
-      <w:bookmarkStart w:id="12" w:name="_Toc218768161"/>
+      <w:bookmarkStart w:id="12" w:name="_Toc219808027"/>
       <w:r>
         <w:t>12</w:t>
       </w:r>
@@ -7545,7 +7821,7 @@
       <w:pPr>
         <w:pStyle w:val="Heading2"/>
       </w:pPr>
-      <w:bookmarkStart w:id="13" w:name="_Toc218768162"/>
+      <w:bookmarkStart w:id="13" w:name="_Toc219808028"/>
       <w:r>
         <w:t>13</w:t>
       </w:r>
@@ -7655,7 +7931,7 @@
       <w:pPr>
         <w:pStyle w:val="Heading1"/>
       </w:pPr>
-      <w:bookmarkStart w:id="14" w:name="_Toc218768163"/>
+      <w:bookmarkStart w:id="14" w:name="_Toc219808029"/>
       <w:r>
         <w:t>Plain Java</w:t>
       </w:r>
@@ -7666,7 +7942,7 @@
       <w:pPr>
         <w:pStyle w:val="Heading2"/>
       </w:pPr>
-      <w:bookmarkStart w:id="15" w:name="_Toc218768164"/>
+      <w:bookmarkStart w:id="15" w:name="_Toc219808030"/>
       <w:r>
         <w:t>College class (simple POJO)</w:t>
       </w:r>
@@ -7785,7 +8061,7 @@
       <w:pPr>
         <w:pStyle w:val="Heading2"/>
       </w:pPr>
-      <w:bookmarkStart w:id="16" w:name="_Toc218768165"/>
+      <w:bookmarkStart w:id="16" w:name="_Toc219808031"/>
       <w:r>
         <w:t>Main class (YOU manage everything)</w:t>
       </w:r>
@@ -7888,7 +8164,7 @@
       <w:pPr>
         <w:pStyle w:val="Heading2"/>
       </w:pPr>
-      <w:bookmarkStart w:id="17" w:name="_Toc218768166"/>
+      <w:bookmarkStart w:id="17" w:name="_Toc219808032"/>
       <w:r>
         <w:lastRenderedPageBreak/>
         <w:t>No Spring means:</w:t>
@@ -7953,7 +8229,7 @@
       <w:pPr>
         <w:pStyle w:val="Heading2"/>
       </w:pPr>
-      <w:bookmarkStart w:id="18" w:name="_Toc218768167"/>
+      <w:bookmarkStart w:id="18" w:name="_Toc219808033"/>
       <w:r>
         <w:t>C</w:t>
       </w:r>
@@ -8183,7 +8459,7 @@
       <w:pPr>
         <w:pStyle w:val="Heading2"/>
       </w:pPr>
-      <w:bookmarkStart w:id="19" w:name="_Toc218768168"/>
+      <w:bookmarkStart w:id="19" w:name="_Toc219808034"/>
       <w:r>
         <w:lastRenderedPageBreak/>
         <w:t>Factory-style Java</w:t>
@@ -8324,7 +8600,7 @@
       <w:pPr>
         <w:pStyle w:val="Heading2"/>
       </w:pPr>
-      <w:bookmarkStart w:id="20" w:name="_Toc218768169"/>
+      <w:bookmarkStart w:id="20" w:name="_Toc219808035"/>
       <w:r>
         <w:t>Why plain Java does NOT scale well</w:t>
       </w:r>
@@ -8458,7 +8734,7 @@
       <w:pPr>
         <w:pStyle w:val="Heading2"/>
       </w:pPr>
-      <w:bookmarkStart w:id="21" w:name="_Toc218768170"/>
+      <w:bookmarkStart w:id="21" w:name="_Toc219808036"/>
       <w:r>
         <w:t>Interview</w:t>
       </w:r>
@@ -8565,7 +8841,7 @@
       <w:pPr>
         <w:pStyle w:val="Heading1"/>
       </w:pPr>
-      <w:bookmarkStart w:id="22" w:name="_Toc218768171"/>
+      <w:bookmarkStart w:id="22" w:name="_Toc219808037"/>
       <w:r>
         <w:t xml:space="preserve">Spring </w:t>
       </w:r>
@@ -8578,7 +8854,7 @@
       <w:pPr>
         <w:pStyle w:val="Heading2"/>
       </w:pPr>
-      <w:bookmarkStart w:id="23" w:name="_Toc218768172"/>
+      <w:bookmarkStart w:id="23" w:name="_Toc219808038"/>
       <w:r>
         <w:t>Example</w:t>
       </w:r>
@@ -8641,7 +8917,7 @@
       <w:pPr>
         <w:pStyle w:val="Heading2"/>
       </w:pPr>
-      <w:bookmarkStart w:id="24" w:name="_Toc218768173"/>
+      <w:bookmarkStart w:id="24" w:name="_Toc219808039"/>
       <w:r>
         <w:t>package</w:t>
       </w:r>
@@ -8747,7 +9023,7 @@
       <w:pPr>
         <w:pStyle w:val="Heading2"/>
       </w:pPr>
-      <w:bookmarkStart w:id="25" w:name="_Toc218768174"/>
+      <w:bookmarkStart w:id="25" w:name="_Toc219808040"/>
       <w:r>
         <w:t>Import Statements</w:t>
       </w:r>
@@ -9048,7 +9324,7 @@
       <w:r>
         <w:br w:type="page"/>
       </w:r>
-      <w:bookmarkStart w:id="26" w:name="_Toc218768175"/>
+      <w:bookmarkStart w:id="26" w:name="_Toc219808041"/>
       <w:r>
         <w:lastRenderedPageBreak/>
         <w:t>Class declaration</w:t>
@@ -9138,7 +9414,7 @@
       <w:pPr>
         <w:pStyle w:val="Heading2"/>
       </w:pPr>
-      <w:bookmarkStart w:id="27" w:name="_Toc218768176"/>
+      <w:bookmarkStart w:id="27" w:name="_Toc219808042"/>
       <w:r>
         <w:rPr>
           <w:rStyle w:val="HTMLCode"/>
@@ -9190,7 +9466,7 @@
       <w:pPr>
         <w:pStyle w:val="Heading2"/>
       </w:pPr>
-      <w:bookmarkStart w:id="28" w:name="_Toc218768177"/>
+      <w:bookmarkStart w:id="28" w:name="_Toc219808043"/>
       <w:r>
         <w:t>Creating Spring Container</w:t>
       </w:r>
@@ -9422,7 +9698,7 @@
       <w:pPr>
         <w:pStyle w:val="Heading2"/>
       </w:pPr>
-      <w:bookmarkStart w:id="29" w:name="_Toc218768178"/>
+      <w:bookmarkStart w:id="29" w:name="_Toc219808044"/>
       <w:r>
         <w:lastRenderedPageBreak/>
         <w:t>Getting a bean from Spring</w:t>
@@ -9617,7 +9893,7 @@
       <w:pPr>
         <w:pStyle w:val="Heading2"/>
       </w:pPr>
-      <w:bookmarkStart w:id="30" w:name="_Toc218768179"/>
+      <w:bookmarkStart w:id="30" w:name="_Toc219808045"/>
       <w:r>
         <w:t>Calling business logic</w:t>
       </w:r>
@@ -9695,7 +9971,7 @@
       <w:pPr>
         <w:pStyle w:val="Heading2"/>
       </w:pPr>
-      <w:bookmarkStart w:id="31" w:name="_Toc218768180"/>
+      <w:bookmarkStart w:id="31" w:name="_Toc219808046"/>
       <w:r>
         <w:t>Execution flow</w:t>
       </w:r>
@@ -9814,7 +10090,7 @@
       <w:pPr>
         <w:pStyle w:val="Heading1"/>
       </w:pPr>
-      <w:bookmarkStart w:id="32" w:name="_Toc218768181"/>
+      <w:bookmarkStart w:id="32" w:name="_Toc219808047"/>
       <w:r>
         <w:t>Spring Boot</w:t>
       </w:r>
@@ -9887,7 +10163,7 @@
       <w:pPr>
         <w:pStyle w:val="Heading2"/>
       </w:pPr>
-      <w:bookmarkStart w:id="33" w:name="_Toc218768182"/>
+      <w:bookmarkStart w:id="33" w:name="_Toc219808048"/>
       <w:r>
         <w:t>Your CURRENT code (Plain Spring)</w:t>
       </w:r>
@@ -10028,7 +10304,7 @@
           <w:rStyle w:val="Strong"/>
         </w:rPr>
       </w:pPr>
-      <w:bookmarkStart w:id="34" w:name="_Toc218768183"/>
+      <w:bookmarkStart w:id="34" w:name="_Toc219808049"/>
       <w:r>
         <w:t xml:space="preserve">Above application using </w:t>
       </w:r>
@@ -10044,7 +10320,7 @@
       <w:pPr>
         <w:pStyle w:val="Heading3"/>
       </w:pPr>
-      <w:bookmarkStart w:id="35" w:name="_Toc218768184"/>
+      <w:bookmarkStart w:id="35" w:name="_Toc219808050"/>
       <w:r>
         <w:t>Main Class</w:t>
       </w:r>
@@ -10226,7 +10502,7 @@
       <w:pPr>
         <w:pStyle w:val="Heading3"/>
       </w:pPr>
-      <w:bookmarkStart w:id="36" w:name="_Toc218768185"/>
+      <w:bookmarkStart w:id="36" w:name="_Toc219808051"/>
       <w:r>
         <w:lastRenderedPageBreak/>
         <w:t>College class (almost same)</w:t>
@@ -10313,7 +10589,7 @@
       <w:pPr>
         <w:pStyle w:val="Heading2"/>
       </w:pPr>
-      <w:bookmarkStart w:id="37" w:name="_Toc218768186"/>
+      <w:bookmarkStart w:id="37" w:name="_Toc219808052"/>
       <w:r>
         <w:t>What changed?</w:t>
       </w:r>
@@ -10376,7 +10652,7 @@
       <w:pPr>
         <w:pStyle w:val="Heading2"/>
       </w:pPr>
-      <w:bookmarkStart w:id="38" w:name="_Toc218768187"/>
+      <w:bookmarkStart w:id="38" w:name="_Toc219808053"/>
       <w:r>
         <w:t xml:space="preserve">What </w:t>
       </w:r>
@@ -10513,7 +10789,7 @@
       <w:pPr>
         <w:pStyle w:val="Heading2"/>
       </w:pPr>
-      <w:bookmarkStart w:id="39" w:name="_Toc218768188"/>
+      <w:bookmarkStart w:id="39" w:name="_Toc219808054"/>
       <w:r>
         <w:lastRenderedPageBreak/>
         <w:t>BENEFITS of Spring Boot</w:t>
@@ -10841,7 +11117,7 @@
       <w:pPr>
         <w:pStyle w:val="Heading2"/>
       </w:pPr>
-      <w:bookmarkStart w:id="40" w:name="_Toc218768189"/>
+      <w:bookmarkStart w:id="40" w:name="_Toc219808055"/>
       <w:r>
         <w:t>How to EXECUTE Spring Boot app</w:t>
       </w:r>
@@ -10978,7 +11254,7 @@
       <w:pPr>
         <w:pStyle w:val="Heading2"/>
       </w:pPr>
-      <w:bookmarkStart w:id="41" w:name="_Toc218768190"/>
+      <w:bookmarkStart w:id="41" w:name="_Toc219808056"/>
       <w:r>
         <w:t>Project structure (Spring Boot way)</w:t>
       </w:r>
@@ -11054,7 +11330,7 @@
       <w:pPr>
         <w:pStyle w:val="Heading2"/>
       </w:pPr>
-      <w:bookmarkStart w:id="42" w:name="_Toc218768191"/>
+      <w:bookmarkStart w:id="42" w:name="_Toc219808057"/>
       <w:r>
         <w:t>Interview</w:t>
       </w:r>
@@ -11070,7 +11346,7 @@
       <w:pPr>
         <w:pStyle w:val="Heading2"/>
       </w:pPr>
-      <w:bookmarkStart w:id="43" w:name="_Toc218768192"/>
+      <w:bookmarkStart w:id="43" w:name="_Toc219808058"/>
       <w:r>
         <w:t>When should YOU use Spring Boot?</w:t>
       </w:r>
@@ -11138,7 +11414,7 @@
       <w:pPr>
         <w:pStyle w:val="Heading1"/>
       </w:pPr>
-      <w:bookmarkStart w:id="44" w:name="_Toc218768193"/>
+      <w:bookmarkStart w:id="44" w:name="_Toc219808059"/>
       <w:r>
         <w:t>Environment in Spring</w:t>
       </w:r>
@@ -11180,7 +11456,7 @@
       <w:pPr>
         <w:pStyle w:val="Heading2"/>
       </w:pPr>
-      <w:bookmarkStart w:id="45" w:name="_Toc218768194"/>
+      <w:bookmarkStart w:id="45" w:name="_Toc219808060"/>
       <w:r>
         <w:t xml:space="preserve">What </w:t>
       </w:r>
@@ -11321,7 +11597,7 @@
       <w:pPr>
         <w:pStyle w:val="Heading2"/>
       </w:pPr>
-      <w:bookmarkStart w:id="46" w:name="_Toc218768195"/>
+      <w:bookmarkStart w:id="46" w:name="_Toc219808061"/>
       <w:r>
         <w:t xml:space="preserve">Why Spring needs </w:t>
       </w:r>
@@ -11488,7 +11764,7 @@
       <w:pPr>
         <w:pStyle w:val="Heading2"/>
       </w:pPr>
-      <w:bookmarkStart w:id="47" w:name="_Toc218768196"/>
+      <w:bookmarkStart w:id="47" w:name="_Toc219808062"/>
       <w:r>
         <w:lastRenderedPageBreak/>
         <w:t xml:space="preserve">What can you do with </w:t>
@@ -11510,7 +11786,7 @@
       <w:pPr>
         <w:pStyle w:val="Heading3"/>
       </w:pPr>
-      <w:bookmarkStart w:id="48" w:name="_Toc218768197"/>
+      <w:bookmarkStart w:id="48" w:name="_Toc219808063"/>
       <w:r>
         <w:t xml:space="preserve">1. </w:t>
       </w:r>
@@ -11726,7 +12002,7 @@
       <w:pPr>
         <w:pStyle w:val="Heading3"/>
       </w:pPr>
-      <w:bookmarkStart w:id="49" w:name="_Toc218768198"/>
+      <w:bookmarkStart w:id="49" w:name="_Toc219808064"/>
       <w:r>
         <w:t>2</w:t>
       </w:r>
@@ -11888,7 +12164,7 @@
       <w:pPr>
         <w:pStyle w:val="Heading3"/>
       </w:pPr>
-      <w:bookmarkStart w:id="50" w:name="_Toc218768199"/>
+      <w:bookmarkStart w:id="50" w:name="_Toc219808065"/>
       <w:r>
         <w:t>3</w:t>
       </w:r>
@@ -12042,7 +12318,7 @@
       <w:pPr>
         <w:pStyle w:val="Heading2"/>
       </w:pPr>
-      <w:bookmarkStart w:id="51" w:name="_Toc218768200"/>
+      <w:bookmarkStart w:id="51" w:name="_Toc219808066"/>
       <w:r>
         <w:lastRenderedPageBreak/>
         <w:t xml:space="preserve">Why not just use </w:t>
@@ -12391,7 +12667,7 @@
       <w:pPr>
         <w:pStyle w:val="Heading3"/>
       </w:pPr>
-      <w:bookmarkStart w:id="52" w:name="_Toc218768201"/>
+      <w:bookmarkStart w:id="52" w:name="_Toc219808067"/>
       <w:r>
         <w:rPr>
           <w:rFonts w:ascii="Segoe UI Symbol" w:hAnsi="Segoe UI Symbol" w:cs="Segoe UI Symbol"/>
@@ -12497,7 +12773,7 @@
       <w:pPr>
         <w:pStyle w:val="Heading3"/>
       </w:pPr>
-      <w:bookmarkStart w:id="53" w:name="_Toc218768202"/>
+      <w:bookmarkStart w:id="53" w:name="_Toc219808068"/>
       <w:r>
         <w:rPr>
           <w:rFonts w:ascii="Segoe UI Symbol" w:hAnsi="Segoe UI Symbol" w:cs="Segoe UI Symbol"/>
@@ -12585,7 +12861,7 @@
       <w:pPr>
         <w:pStyle w:val="Heading3"/>
       </w:pPr>
-      <w:bookmarkStart w:id="54" w:name="_Toc218768203"/>
+      <w:bookmarkStart w:id="54" w:name="_Toc219808069"/>
       <w:r>
         <w:rPr>
           <w:rFonts w:ascii="Segoe UI Symbol" w:hAnsi="Segoe UI Symbol" w:cs="Segoe UI Symbol"/>
@@ -12647,7 +12923,7 @@
       <w:pPr>
         <w:pStyle w:val="Heading2"/>
       </w:pPr>
-      <w:bookmarkStart w:id="55" w:name="_Toc218768204"/>
+      <w:bookmarkStart w:id="55" w:name="_Toc219808070"/>
       <w:r>
         <w:lastRenderedPageBreak/>
         <w:t xml:space="preserve">How Spring populates </w:t>
@@ -12820,7 +13096,7 @@
       <w:pPr>
         <w:pStyle w:val="Heading2"/>
       </w:pPr>
-      <w:bookmarkStart w:id="56" w:name="_Toc218768205"/>
+      <w:bookmarkStart w:id="56" w:name="_Toc219808071"/>
       <w:r>
         <w:t>Spring Boot vs Spring Framework</w:t>
       </w:r>
@@ -12941,7 +13217,7 @@
       <w:pPr>
         <w:pStyle w:val="Heading2"/>
       </w:pPr>
-      <w:bookmarkStart w:id="57" w:name="_Toc218768206"/>
+      <w:bookmarkStart w:id="57" w:name="_Toc219808072"/>
       <w:r>
         <w:t xml:space="preserve">When SHOULD you use </w:t>
       </w:r>
@@ -13019,7 +13295,7 @@
       <w:pPr>
         <w:pStyle w:val="Heading2"/>
       </w:pPr>
-      <w:bookmarkStart w:id="58" w:name="_Toc218768207"/>
+      <w:bookmarkStart w:id="58" w:name="_Toc219808073"/>
       <w:r>
         <w:t>When you should NOT</w:t>
       </w:r>
@@ -13091,7 +13367,7 @@
       <w:pPr>
         <w:pStyle w:val="Heading2"/>
       </w:pPr>
-      <w:bookmarkStart w:id="59" w:name="_Toc218768208"/>
+      <w:bookmarkStart w:id="59" w:name="_Toc219808074"/>
       <w:r>
         <w:lastRenderedPageBreak/>
         <w:t>High level comparision</w:t>
@@ -13160,7 +13436,7 @@
       <w:pPr>
         <w:pStyle w:val="Heading2"/>
       </w:pPr>
-      <w:bookmarkStart w:id="60" w:name="_Toc218768209"/>
+      <w:bookmarkStart w:id="60" w:name="_Toc219808075"/>
       <w:r>
         <w:lastRenderedPageBreak/>
         <w:t xml:space="preserve">Hand on – </w:t>
@@ -13242,7 +13518,7 @@
       <w:pPr>
         <w:pStyle w:val="Heading3"/>
       </w:pPr>
-      <w:bookmarkStart w:id="61" w:name="_Toc218768210"/>
+      <w:bookmarkStart w:id="61" w:name="_Toc219808076"/>
       <w:r>
         <w:t>Gradle build file</w:t>
       </w:r>
@@ -13348,7 +13624,7 @@
       <w:pPr>
         <w:pStyle w:val="Heading3"/>
       </w:pPr>
-      <w:bookmarkStart w:id="62" w:name="_Toc218768211"/>
+      <w:bookmarkStart w:id="62" w:name="_Toc219808077"/>
       <w:r>
         <w:lastRenderedPageBreak/>
         <w:t>application.properties (BASE configuration)</w:t>
@@ -13414,7 +13690,7 @@
       <w:pPr>
         <w:pStyle w:val="Heading3"/>
       </w:pPr>
-      <w:bookmarkStart w:id="63" w:name="_Toc218768212"/>
+      <w:bookmarkStart w:id="63" w:name="_Toc219808078"/>
       <w:r>
         <w:t>application-dev.yml (DEV profile)</w:t>
       </w:r>
@@ -13493,7 +13769,7 @@
       <w:pPr>
         <w:pStyle w:val="Heading3"/>
       </w:pPr>
-      <w:bookmarkStart w:id="64" w:name="_Toc218768213"/>
+      <w:bookmarkStart w:id="64" w:name="_Toc219808079"/>
       <w:r>
         <w:t>application-prod.yml (PROD profile)</w:t>
       </w:r>
@@ -13572,7 +13848,7 @@
       <w:pPr>
         <w:pStyle w:val="Heading3"/>
       </w:pPr>
-      <w:bookmarkStart w:id="65" w:name="_Toc218768214"/>
+      <w:bookmarkStart w:id="65" w:name="_Toc219808080"/>
       <w:r>
         <w:t>Main application class</w:t>
       </w:r>
@@ -13636,7 +13912,7 @@
       <w:pPr>
         <w:pStyle w:val="Heading3"/>
       </w:pPr>
-      <w:bookmarkStart w:id="66" w:name="_Toc218768215"/>
+      <w:bookmarkStart w:id="66" w:name="_Toc219808081"/>
       <w:r>
         <w:lastRenderedPageBreak/>
         <w:t>Environment reader bean (MOST IMPORTANT PART)</w:t>
@@ -13725,7 +14001,7 @@
       <w:pPr>
         <w:pStyle w:val="Heading3"/>
       </w:pPr>
-      <w:bookmarkStart w:id="67" w:name="_Toc218768216"/>
+      <w:bookmarkStart w:id="67" w:name="_Toc219808082"/>
       <w:r>
         <w:t>Run scenarios (THIS IS WHERE YOU LEARN)</w:t>
       </w:r>
@@ -13747,6 +14023,10 @@
     </w:p>
     <w:p>
       <w:r>
+        <w:rPr>
+          <w:noProof/>
+          <w:lang w:eastAsia="en-GB"/>
+        </w:rPr>
         <w:drawing>
           <wp:inline distT="0" distB="0" distL="0" distR="0">
             <wp:extent cx="6300470" cy="2789008"/>
@@ -13824,6 +14104,10 @@
     </w:p>
     <w:p>
       <w:r>
+        <w:rPr>
+          <w:noProof/>
+          <w:lang w:eastAsia="en-GB"/>
+        </w:rPr>
         <w:drawing>
           <wp:inline distT="0" distB="0" distL="0" distR="0">
             <wp:extent cx="6300470" cy="2787719"/>
@@ -13886,6 +14170,10 @@
     </w:p>
     <w:p>
       <w:r>
+        <w:rPr>
+          <w:noProof/>
+          <w:lang w:eastAsia="en-GB"/>
+        </w:rPr>
         <w:drawing>
           <wp:inline distT="0" distB="0" distL="0" distR="0">
             <wp:extent cx="6300470" cy="2531489"/>
@@ -14005,7 +14293,7 @@
       <w:pPr>
         <w:pStyle w:val="Heading3"/>
       </w:pPr>
-      <w:bookmarkStart w:id="68" w:name="_Toc218768217"/>
+      <w:bookmarkStart w:id="68" w:name="_Toc219808083"/>
       <w:r>
         <w:t>Property resolution order (MEMORIZE THIS)</w:t>
       </w:r>
@@ -14088,7 +14376,7 @@
       <w:pPr>
         <w:pStyle w:val="Heading1"/>
       </w:pPr>
-      <w:bookmarkStart w:id="69" w:name="_Toc218768218"/>
+      <w:bookmarkStart w:id="69" w:name="_Toc219808084"/>
       <w:r>
         <w:lastRenderedPageBreak/>
         <w:t>REST API</w:t>
@@ -14298,7 +14586,7 @@
       <w:pPr>
         <w:pStyle w:val="Heading2"/>
       </w:pPr>
-      <w:bookmarkStart w:id="70" w:name="_Toc218768219"/>
+      <w:bookmarkStart w:id="70" w:name="_Toc219808085"/>
       <w:r>
         <w:t>Create a Spring Boot project</w:t>
       </w:r>
@@ -14336,7 +14624,7 @@
       <w:pPr>
         <w:pStyle w:val="Heading2"/>
       </w:pPr>
-      <w:bookmarkStart w:id="71" w:name="_Toc218768220"/>
+      <w:bookmarkStart w:id="71" w:name="_Toc219808086"/>
       <w:r>
         <w:t>Required dependency</w:t>
       </w:r>
@@ -14563,7 +14851,7 @@
       <w:pPr>
         <w:pStyle w:val="Heading2"/>
       </w:pPr>
-      <w:bookmarkStart w:id="72" w:name="_Toc218768221"/>
+      <w:bookmarkStart w:id="72" w:name="_Toc219808087"/>
       <w:r>
         <w:t>Project structure (IMPORTANT)</w:t>
       </w:r>
@@ -14641,7 +14929,7 @@
       <w:pPr>
         <w:pStyle w:val="Heading2"/>
       </w:pPr>
-      <w:bookmarkStart w:id="73" w:name="_Toc218768222"/>
+      <w:bookmarkStart w:id="73" w:name="_Toc219808088"/>
       <w:r>
         <w:lastRenderedPageBreak/>
         <w:t>Main Application class</w:t>
@@ -14782,7 +15070,7 @@
       <w:pPr>
         <w:pStyle w:val="Heading2"/>
       </w:pPr>
-      <w:bookmarkStart w:id="74" w:name="_Toc218768223"/>
+      <w:bookmarkStart w:id="74" w:name="_Toc219808089"/>
       <w:r>
         <w:t>Business logic (same as before)</w:t>
       </w:r>
@@ -14942,7 +15230,7 @@
       <w:pPr>
         <w:pStyle w:val="Heading2"/>
       </w:pPr>
-      <w:bookmarkStart w:id="75" w:name="_Toc218768224"/>
+      <w:bookmarkStart w:id="75" w:name="_Toc219808090"/>
       <w:r>
         <w:lastRenderedPageBreak/>
         <w:t>REST Controller (NEW)</w:t>
@@ -15087,7 +15375,7 @@
       <w:pPr>
         <w:pStyle w:val="Heading2"/>
       </w:pPr>
-      <w:bookmarkStart w:id="76" w:name="_Toc218768225"/>
+      <w:bookmarkStart w:id="76" w:name="_Toc219808091"/>
       <w:r>
         <w:t>What annotations mean (VERY IMPORTANT)</w:t>
       </w:r>
@@ -15150,7 +15438,7 @@
       <w:pPr>
         <w:pStyle w:val="Heading2"/>
       </w:pPr>
-      <w:bookmarkStart w:id="77" w:name="_Toc218768226"/>
+      <w:bookmarkStart w:id="77" w:name="_Toc219808092"/>
       <w:r>
         <w:t>How execution works (FLOW)</w:t>
       </w:r>
@@ -15253,7 +15541,7 @@
       <w:pPr>
         <w:pStyle w:val="Heading2"/>
       </w:pPr>
-      <w:bookmarkStart w:id="78" w:name="_Toc218768227"/>
+      <w:bookmarkStart w:id="78" w:name="_Toc219808093"/>
       <w:r>
         <w:lastRenderedPageBreak/>
         <w:t>How to RUN the application</w:t>
@@ -15390,7 +15678,7 @@
       <w:pPr>
         <w:pStyle w:val="Heading2"/>
       </w:pPr>
-      <w:bookmarkStart w:id="79" w:name="_Toc218768228"/>
+      <w:bookmarkStart w:id="79" w:name="_Toc219808094"/>
       <w:r>
         <w:t>How to TEST the REST API</w:t>
       </w:r>
@@ -15477,7 +15765,7 @@
       <w:pPr>
         <w:pStyle w:val="Heading2"/>
       </w:pPr>
-      <w:bookmarkStart w:id="80" w:name="_Toc218768229"/>
+      <w:bookmarkStart w:id="80" w:name="_Toc219808095"/>
       <w:r>
         <w:t xml:space="preserve">Why REST API is better than </w:t>
       </w:r>
@@ -15550,7 +15838,7 @@
       <w:pPr>
         <w:pStyle w:val="Heading2"/>
       </w:pPr>
-      <w:bookmarkStart w:id="81" w:name="_Toc218768230"/>
+      <w:bookmarkStart w:id="81" w:name="_Toc219808096"/>
       <w:r>
         <w:t>Interview one-liner</w:t>
       </w:r>
@@ -15587,7 +15875,7 @@
       <w:pPr>
         <w:pStyle w:val="Heading2"/>
       </w:pPr>
-      <w:bookmarkStart w:id="82" w:name="_Toc218768231"/>
+      <w:bookmarkStart w:id="82" w:name="_Toc219808097"/>
       <w:r>
         <w:lastRenderedPageBreak/>
         <w:t>What next</w:t>
@@ -15695,9 +15983,1009 @@
       </w:r>
     </w:p>
     <w:p/>
+    <w:p>
+      <w:r>
+        <w:br w:type="page"/>
+      </w:r>
+    </w:p>
+    <w:p>
+      <w:pPr>
+        <w:pStyle w:val="Heading1"/>
+      </w:pPr>
+    </w:p>
+    <w:p>
+      <w:pPr>
+        <w:pStyle w:val="Heading1"/>
+      </w:pPr>
+      <w:bookmarkStart w:id="83" w:name="_Toc219808098"/>
+      <w:r>
+        <w:t>DB Access</w:t>
+      </w:r>
+      <w:bookmarkEnd w:id="83"/>
+    </w:p>
+    <w:p>
+      <w:r>
+        <w:rPr>
+          <w:rStyle w:val="Strong"/>
+        </w:rPr>
+        <w:t>Spring Boot manages the connection pool for your project</w:t>
+      </w:r>
+      <w:r>
+        <w:br/>
+        <w:t xml:space="preserve">You should </w:t>
+      </w:r>
+      <w:r>
+        <w:rPr>
+          <w:rStyle w:val="Strong"/>
+        </w:rPr>
+        <w:t>never manually open/close connections everywhere</w:t>
+      </w:r>
+      <w:r>
+        <w:t>.</w:t>
+      </w:r>
+    </w:p>
+    <w:p>
+      <w:pPr>
+        <w:pStyle w:val="Heading2"/>
+      </w:pPr>
+      <w:bookmarkStart w:id="84" w:name="_Toc219808099"/>
+      <w:r>
+        <w:t>Layers in accessing a Database</w:t>
+      </w:r>
+      <w:bookmarkEnd w:id="84"/>
+    </w:p>
+    <w:p>
+      <w:r>
+        <w:t>Controller  →  Service  →  Repository (DAO)  →  Database</w:t>
+      </w:r>
+    </w:p>
+    <w:p>
+      <w:pPr>
+        <w:pStyle w:val="NoSpacing"/>
+      </w:pPr>
+      <w:r>
+        <w:rPr>
+          <w:rFonts w:hAnsi="Symbol"/>
+        </w:rPr>
+        <w:t></w:t>
+      </w:r>
+      <w:r>
+        <w:t xml:space="preserve">  </w:t>
+      </w:r>
+      <w:r>
+        <w:rPr>
+          <w:rStyle w:val="Strong"/>
+        </w:rPr>
+        <w:t>Controller</w:t>
+      </w:r>
+      <w:r>
+        <w:t xml:space="preserve"> → handles HTTP requests (optional if not REST)</w:t>
+      </w:r>
+    </w:p>
+    <w:p>
+      <w:pPr>
+        <w:pStyle w:val="NoSpacing"/>
+      </w:pPr>
+      <w:r>
+        <w:rPr>
+          <w:rFonts w:hAnsi="Symbol"/>
+        </w:rPr>
+        <w:t></w:t>
+      </w:r>
+      <w:r>
+        <w:t xml:space="preserve">  </w:t>
+      </w:r>
+      <w:r>
+        <w:rPr>
+          <w:rStyle w:val="Strong"/>
+        </w:rPr>
+        <w:t>Service</w:t>
+      </w:r>
+      <w:r>
+        <w:t xml:space="preserve"> → business logic</w:t>
+      </w:r>
+    </w:p>
+    <w:p>
+      <w:pPr>
+        <w:pStyle w:val="NoSpacing"/>
+      </w:pPr>
+      <w:r>
+        <w:rPr>
+          <w:rFonts w:hAnsi="Symbol"/>
+        </w:rPr>
+        <w:t></w:t>
+      </w:r>
+      <w:r>
+        <w:t xml:space="preserve">  </w:t>
+      </w:r>
+      <w:r>
+        <w:rPr>
+          <w:rStyle w:val="Strong"/>
+        </w:rPr>
+        <w:t>Repository (DAO)</w:t>
+      </w:r>
+      <w:r>
+        <w:t xml:space="preserve"> → all SQL (SELECT / UPDATE / DELETE)</w:t>
+      </w:r>
+    </w:p>
+    <w:p>
+      <w:pPr>
+        <w:pStyle w:val="NoSpacing"/>
+      </w:pPr>
+      <w:r>
+        <w:rPr>
+          <w:rFonts w:hAnsi="Symbol"/>
+        </w:rPr>
+        <w:t></w:t>
+      </w:r>
+      <w:r>
+        <w:t xml:space="preserve">  </w:t>
+      </w:r>
+      <w:r>
+        <w:rPr>
+          <w:rStyle w:val="Strong"/>
+        </w:rPr>
+        <w:t>DataSource</w:t>
+      </w:r>
+      <w:r>
+        <w:t xml:space="preserve"> → manages JDBC connections (Spring handles this)</w:t>
+      </w:r>
+    </w:p>
     <w:p/>
+    <w:p>
+      <w:pPr>
+        <w:pStyle w:val="Heading2"/>
+      </w:pPr>
+      <w:bookmarkStart w:id="85" w:name="_Toc219808100"/>
+      <w:r>
+        <w:t>Handle DB connection</w:t>
+      </w:r>
+      <w:bookmarkEnd w:id="85"/>
+    </w:p>
+    <w:p>
+      <w:pPr>
+        <w:pStyle w:val="NormalWeb"/>
+      </w:pPr>
+      <w:r>
+        <w:t xml:space="preserve">Use </w:t>
+      </w:r>
+      <w:r>
+        <w:rPr>
+          <w:rStyle w:val="Strong"/>
+        </w:rPr>
+        <w:t>DataSource + JdbcTemplate</w:t>
+      </w:r>
+    </w:p>
+    <w:p>
+      <w:pPr>
+        <w:pStyle w:val="NormalWeb"/>
+      </w:pPr>
+      <w:r>
+        <w:t>Spring</w:t>
+      </w:r>
+      <w:r>
+        <w:t xml:space="preserve"> Boot auto-configures this from </w:t>
+      </w:r>
+      <w:r>
+        <w:t>Properties file</w:t>
+      </w:r>
+    </w:p>
+    <w:tbl>
+      <w:tblPr>
+        <w:tblStyle w:val="TableGrid"/>
+        <w:tblW w:w="0" w:type="auto"/>
+        <w:tblLook w:val="04A0"/>
+      </w:tblPr>
+      <w:tblGrid>
+        <w:gridCol w:w="10138"/>
+      </w:tblGrid>
+      <w:tr>
+        <w:tc>
+          <w:tcPr>
+            <w:tcW w:w="10138" w:type="dxa"/>
+          </w:tcPr>
+          <w:p>
+            <w:r>
+              <w:t>spring.datasource.url=jdbc:oracle:thin:@localhost:1521/orclpdb</w:t>
+            </w:r>
+          </w:p>
+          <w:p>
+            <w:r>
+              <w:t>spring.datasource.username=app_user</w:t>
+            </w:r>
+          </w:p>
+          <w:p>
+            <w:r>
+              <w:t>spring.datasource.password=secret</w:t>
+            </w:r>
+          </w:p>
+          <w:p>
+            <w:r>
+              <w:t>spring.datasource.driver-class-name=oracle.jdbc.OracleDriver</w:t>
+            </w:r>
+          </w:p>
+        </w:tc>
+      </w:tr>
+    </w:tbl>
+    <w:p/>
+    <w:p>
+      <w:pPr>
+        <w:rPr>
+          <w:rFonts w:asciiTheme="majorHAnsi" w:eastAsiaTheme="majorEastAsia" w:hAnsiTheme="majorHAnsi" w:cstheme="majorBidi"/>
+          <w:b/>
+          <w:bCs/>
+          <w:color w:val="4F81BD" w:themeColor="accent1"/>
+          <w:sz w:val="30"/>
+          <w:szCs w:val="26"/>
+        </w:rPr>
+      </w:pPr>
+    </w:p>
+    <w:p>
+      <w:pPr>
+        <w:pStyle w:val="Heading2"/>
+      </w:pPr>
+      <w:bookmarkStart w:id="86" w:name="_Toc219808101"/>
+      <w:r>
+        <w:t>Package Structure</w:t>
+      </w:r>
+      <w:bookmarkEnd w:id="86"/>
+    </w:p>
+    <w:p>
+      <w:r>
+        <w:t xml:space="preserve">This follows </w:t>
+      </w:r>
+      <w:r>
+        <w:rPr>
+          <w:rStyle w:val="Strong"/>
+        </w:rPr>
+        <w:t>Java + Spring standards</w:t>
+      </w:r>
+      <w:r>
+        <w:t>.</w:t>
+      </w:r>
+    </w:p>
+    <w:p>
+      <w:pPr>
+        <w:pStyle w:val="NoSpacing"/>
+      </w:pPr>
+      <w:r>
+        <w:rPr>
+          <w:noProof/>
+          <w:lang w:eastAsia="en-GB"/>
+        </w:rPr>
+        <w:drawing>
+          <wp:inline distT="0" distB="0" distL="0" distR="0">
+            <wp:extent cx="3853815" cy="2699385"/>
+            <wp:effectExtent l="19050" t="0" r="0" b="0"/>
+            <wp:docPr id="36" name="Picture 34"/>
+            <wp:cNvGraphicFramePr>
+              <a:graphicFrameLocks xmlns:a="http://schemas.openxmlformats.org/drawingml/2006/main" noChangeAspect="1"/>
+            </wp:cNvGraphicFramePr>
+            <a:graphic xmlns:a="http://schemas.openxmlformats.org/drawingml/2006/main">
+              <a:graphicData uri="http://schemas.openxmlformats.org/drawingml/2006/picture">
+                <pic:pic xmlns:pic="http://schemas.openxmlformats.org/drawingml/2006/picture">
+                  <pic:nvPicPr>
+                    <pic:cNvPr id="0" name="Picture 34"/>
+                    <pic:cNvPicPr>
+                      <a:picLocks noChangeAspect="1" noChangeArrowheads="1"/>
+                    </pic:cNvPicPr>
+                  </pic:nvPicPr>
+                  <pic:blipFill>
+                    <a:blip r:embed="rId30" cstate="print"/>
+                    <a:srcRect/>
+                    <a:stretch>
+                      <a:fillRect/>
+                    </a:stretch>
+                  </pic:blipFill>
+                  <pic:spPr bwMode="auto">
+                    <a:xfrm>
+                      <a:off x="0" y="0"/>
+                      <a:ext cx="3853815" cy="2699385"/>
+                    </a:xfrm>
+                    <a:prstGeom prst="rect">
+                      <a:avLst/>
+                    </a:prstGeom>
+                    <a:noFill/>
+                    <a:ln w="9525">
+                      <a:noFill/>
+                      <a:miter lim="800000"/>
+                      <a:headEnd/>
+                      <a:tailEnd/>
+                    </a:ln>
+                  </pic:spPr>
+                </pic:pic>
+              </a:graphicData>
+            </a:graphic>
+          </wp:inline>
+        </w:drawing>
+      </w:r>
+    </w:p>
+    <w:p>
+      <w:pPr>
+        <w:pStyle w:val="NoSpacing"/>
+      </w:pPr>
+    </w:p>
+    <w:tbl>
+      <w:tblPr>
+        <w:tblStyle w:val="TableGrid"/>
+        <w:tblW w:w="0" w:type="auto"/>
+        <w:tblLook w:val="04A0"/>
+      </w:tblPr>
+      <w:tblGrid>
+        <w:gridCol w:w="5131"/>
+        <w:gridCol w:w="41"/>
+        <w:gridCol w:w="4966"/>
+      </w:tblGrid>
+      <w:tr>
+        <w:tc>
+          <w:tcPr>
+            <w:tcW w:w="10138" w:type="dxa"/>
+            <w:gridSpan w:val="3"/>
+          </w:tcPr>
+          <w:p>
+            <w:pPr>
+              <w:pStyle w:val="NoSpacing"/>
+              <w:rPr>
+                <w:b/>
+              </w:rPr>
+            </w:pPr>
+            <w:r>
+              <w:rPr>
+                <w:b/>
+              </w:rPr>
+              <w:t>CollegeApplication</w:t>
+            </w:r>
+          </w:p>
+          <w:p>
+            <w:pPr>
+              <w:pStyle w:val="NoSpacing"/>
+            </w:pPr>
+            <w:r>
+              <w:rPr>
+                <w:noProof/>
+                <w:lang w:eastAsia="en-GB"/>
+              </w:rPr>
+              <w:lastRenderedPageBreak/>
+              <w:drawing>
+                <wp:inline distT="0" distB="0" distL="0" distR="0">
+                  <wp:extent cx="4577354" cy="2368082"/>
+                  <wp:effectExtent l="19050" t="0" r="0" b="0"/>
+                  <wp:docPr id="41" name="Picture 37"/>
+                  <wp:cNvGraphicFramePr>
+                    <a:graphicFrameLocks xmlns:a="http://schemas.openxmlformats.org/drawingml/2006/main" noChangeAspect="1"/>
+                  </wp:cNvGraphicFramePr>
+                  <a:graphic xmlns:a="http://schemas.openxmlformats.org/drawingml/2006/main">
+                    <a:graphicData uri="http://schemas.openxmlformats.org/drawingml/2006/picture">
+                      <pic:pic xmlns:pic="http://schemas.openxmlformats.org/drawingml/2006/picture">
+                        <pic:nvPicPr>
+                          <pic:cNvPr id="0" name="Picture 37"/>
+                          <pic:cNvPicPr>
+                            <a:picLocks noChangeAspect="1" noChangeArrowheads="1"/>
+                          </pic:cNvPicPr>
+                        </pic:nvPicPr>
+                        <pic:blipFill>
+                          <a:blip r:embed="rId31" cstate="print"/>
+                          <a:srcRect/>
+                          <a:stretch>
+                            <a:fillRect/>
+                          </a:stretch>
+                        </pic:blipFill>
+                        <pic:spPr bwMode="auto">
+                          <a:xfrm>
+                            <a:off x="0" y="0"/>
+                            <a:ext cx="4577013" cy="2367905"/>
+                          </a:xfrm>
+                          <a:prstGeom prst="rect">
+                            <a:avLst/>
+                          </a:prstGeom>
+                          <a:noFill/>
+                          <a:ln w="9525">
+                            <a:noFill/>
+                            <a:miter lim="800000"/>
+                            <a:headEnd/>
+                            <a:tailEnd/>
+                          </a:ln>
+                        </pic:spPr>
+                      </pic:pic>
+                    </a:graphicData>
+                  </a:graphic>
+                </wp:inline>
+              </w:drawing>
+            </w:r>
+          </w:p>
+        </w:tc>
+      </w:tr>
+      <w:tr>
+        <w:tc>
+          <w:tcPr>
+            <w:tcW w:w="5172" w:type="dxa"/>
+            <w:gridSpan w:val="2"/>
+          </w:tcPr>
+          <w:p>
+            <w:pPr>
+              <w:pStyle w:val="NoSpacing"/>
+              <w:rPr>
+                <w:noProof/>
+                <w:lang w:eastAsia="en-GB"/>
+              </w:rPr>
+            </w:pPr>
+          </w:p>
+          <w:p>
+            <w:pPr>
+              <w:pStyle w:val="NoSpacing"/>
+              <w:rPr>
+                <w:b/>
+              </w:rPr>
+            </w:pPr>
+            <w:r>
+              <w:rPr>
+                <w:b/>
+              </w:rPr>
+              <w:t xml:space="preserve">Controller </w:t>
+            </w:r>
+          </w:p>
+          <w:p>
+            <w:pPr>
+              <w:pStyle w:val="NoSpacing"/>
+            </w:pPr>
+          </w:p>
+          <w:p>
+            <w:pPr>
+              <w:pStyle w:val="NoSpacing"/>
+            </w:pPr>
+            <w:r>
+              <w:t>optional, if REST API</w:t>
+            </w:r>
+          </w:p>
+          <w:p>
+            <w:pPr>
+              <w:pStyle w:val="NoSpacing"/>
+            </w:pPr>
+            <w:r>
+              <w:rPr>
+                <w:noProof/>
+                <w:lang w:eastAsia="en-GB"/>
+              </w:rPr>
+              <w:drawing>
+                <wp:inline distT="0" distB="0" distL="0" distR="0">
+                  <wp:extent cx="3298780" cy="2536372"/>
+                  <wp:effectExtent l="19050" t="0" r="0" b="0"/>
+                  <wp:docPr id="40" name="Picture 28"/>
+                  <wp:cNvGraphicFramePr>
+                    <a:graphicFrameLocks xmlns:a="http://schemas.openxmlformats.org/drawingml/2006/main" noChangeAspect="1"/>
+                  </wp:cNvGraphicFramePr>
+                  <a:graphic xmlns:a="http://schemas.openxmlformats.org/drawingml/2006/main">
+                    <a:graphicData uri="http://schemas.openxmlformats.org/drawingml/2006/picture">
+                      <pic:pic xmlns:pic="http://schemas.openxmlformats.org/drawingml/2006/picture">
+                        <pic:nvPicPr>
+                          <pic:cNvPr id="0" name="Picture 28"/>
+                          <pic:cNvPicPr>
+                            <a:picLocks noChangeAspect="1" noChangeArrowheads="1"/>
+                          </pic:cNvPicPr>
+                        </pic:nvPicPr>
+                        <pic:blipFill>
+                          <a:blip r:embed="rId32" cstate="print"/>
+                          <a:srcRect/>
+                          <a:stretch>
+                            <a:fillRect/>
+                          </a:stretch>
+                        </pic:blipFill>
+                        <pic:spPr bwMode="auto">
+                          <a:xfrm>
+                            <a:off x="0" y="0"/>
+                            <a:ext cx="3300012" cy="2537319"/>
+                          </a:xfrm>
+                          <a:prstGeom prst="rect">
+                            <a:avLst/>
+                          </a:prstGeom>
+                          <a:noFill/>
+                          <a:ln w="9525">
+                            <a:noFill/>
+                            <a:miter lim="800000"/>
+                            <a:headEnd/>
+                            <a:tailEnd/>
+                          </a:ln>
+                        </pic:spPr>
+                      </pic:pic>
+                    </a:graphicData>
+                  </a:graphic>
+                </wp:inline>
+              </w:drawing>
+            </w:r>
+          </w:p>
+        </w:tc>
+        <w:tc>
+          <w:tcPr>
+            <w:tcW w:w="4966" w:type="dxa"/>
+          </w:tcPr>
+          <w:p>
+            <w:pPr>
+              <w:pStyle w:val="NoSpacing"/>
+            </w:pPr>
+          </w:p>
+          <w:p>
+            <w:pPr>
+              <w:pStyle w:val="NoSpacing"/>
+              <w:rPr>
+                <w:b/>
+              </w:rPr>
+            </w:pPr>
+            <w:r>
+              <w:rPr>
+                <w:b/>
+              </w:rPr>
+              <w:t xml:space="preserve">Model Class </w:t>
+            </w:r>
+          </w:p>
+          <w:p>
+            <w:pPr>
+              <w:pStyle w:val="NoSpacing"/>
+            </w:pPr>
+            <w:r>
+              <w:rPr>
+                <w:rFonts w:ascii="MS Gothic" w:eastAsia="MS Gothic" w:hAnsi="MS Gothic" w:cs="MS Gothic" w:hint="eastAsia"/>
+              </w:rPr>
+              <w:t>✔</w:t>
+            </w:r>
+            <w:r>
+              <w:t xml:space="preserve"> No DB code</w:t>
+            </w:r>
+            <w:r>
+              <w:br/>
+            </w:r>
+            <w:r>
+              <w:rPr>
+                <w:rFonts w:ascii="MS Gothic" w:eastAsia="MS Gothic" w:hAnsi="MS Gothic" w:cs="MS Gothic" w:hint="eastAsia"/>
+              </w:rPr>
+              <w:t>✔</w:t>
+            </w:r>
+            <w:r>
+              <w:t xml:space="preserve"> Just data</w:t>
+            </w:r>
+          </w:p>
+          <w:p>
+            <w:pPr>
+              <w:pStyle w:val="NoSpacing"/>
+            </w:pPr>
+          </w:p>
+          <w:p>
+            <w:pPr>
+              <w:pStyle w:val="NoSpacing"/>
+            </w:pPr>
+          </w:p>
+          <w:p>
+            <w:pPr>
+              <w:pStyle w:val="NoSpacing"/>
+            </w:pPr>
+            <w:r>
+              <w:rPr>
+                <w:noProof/>
+                <w:lang w:eastAsia="en-GB"/>
+              </w:rPr>
+              <w:drawing>
+                <wp:inline distT="0" distB="0" distL="0" distR="0">
+                  <wp:extent cx="3167489" cy="2111829"/>
+                  <wp:effectExtent l="19050" t="0" r="0" b="0"/>
+                  <wp:docPr id="38" name="Picture 31"/>
+                  <wp:cNvGraphicFramePr>
+                    <a:graphicFrameLocks xmlns:a="http://schemas.openxmlformats.org/drawingml/2006/main" noChangeAspect="1"/>
+                  </wp:cNvGraphicFramePr>
+                  <a:graphic xmlns:a="http://schemas.openxmlformats.org/drawingml/2006/main">
+                    <a:graphicData uri="http://schemas.openxmlformats.org/drawingml/2006/picture">
+                      <pic:pic xmlns:pic="http://schemas.openxmlformats.org/drawingml/2006/picture">
+                        <pic:nvPicPr>
+                          <pic:cNvPr id="0" name="Picture 31"/>
+                          <pic:cNvPicPr>
+                            <a:picLocks noChangeAspect="1" noChangeArrowheads="1"/>
+                          </pic:cNvPicPr>
+                        </pic:nvPicPr>
+                        <pic:blipFill>
+                          <a:blip r:embed="rId33" cstate="print"/>
+                          <a:srcRect/>
+                          <a:stretch>
+                            <a:fillRect/>
+                          </a:stretch>
+                        </pic:blipFill>
+                        <pic:spPr bwMode="auto">
+                          <a:xfrm>
+                            <a:off x="0" y="0"/>
+                            <a:ext cx="3167816" cy="2112047"/>
+                          </a:xfrm>
+                          <a:prstGeom prst="rect">
+                            <a:avLst/>
+                          </a:prstGeom>
+                          <a:noFill/>
+                          <a:ln w="9525">
+                            <a:noFill/>
+                            <a:miter lim="800000"/>
+                            <a:headEnd/>
+                            <a:tailEnd/>
+                          </a:ln>
+                        </pic:spPr>
+                      </pic:pic>
+                    </a:graphicData>
+                  </a:graphic>
+                </wp:inline>
+              </w:drawing>
+            </w:r>
+          </w:p>
+        </w:tc>
+      </w:tr>
+      <w:tr>
+        <w:tc>
+          <w:tcPr>
+            <w:tcW w:w="5118" w:type="dxa"/>
+          </w:tcPr>
+          <w:p>
+            <w:pPr>
+              <w:pStyle w:val="NoSpacing"/>
+              <w:rPr>
+                <w:b/>
+              </w:rPr>
+            </w:pPr>
+            <w:r>
+              <w:rPr>
+                <w:b/>
+              </w:rPr>
+              <w:t>Repository layer (ALL SQL goes here)</w:t>
+            </w:r>
+          </w:p>
+          <w:p>
+            <w:pPr>
+              <w:pStyle w:val="NoSpacing"/>
+              <w:rPr>
+                <w:b/>
+              </w:rPr>
+            </w:pPr>
+          </w:p>
+          <w:p>
+            <w:r>
+              <w:rPr>
+                <w:rFonts w:hAnsi="Symbol"/>
+              </w:rPr>
+              <w:t></w:t>
+            </w:r>
+            <w:r>
+              <w:t xml:space="preserve">  One class = </w:t>
+            </w:r>
+            <w:r>
+              <w:rPr>
+                <w:rStyle w:val="Strong"/>
+              </w:rPr>
+              <w:t>one table</w:t>
+            </w:r>
+          </w:p>
+          <w:p>
+            <w:r>
+              <w:rPr>
+                <w:rFonts w:hAnsi="Symbol"/>
+              </w:rPr>
+              <w:t></w:t>
+            </w:r>
+            <w:r>
+              <w:t xml:space="preserve">  All SQL in </w:t>
+            </w:r>
+            <w:r>
+              <w:rPr>
+                <w:rStyle w:val="Strong"/>
+              </w:rPr>
+              <w:t>one place</w:t>
+            </w:r>
+          </w:p>
+          <w:p>
+            <w:r>
+              <w:rPr>
+                <w:rFonts w:hAnsi="Symbol"/>
+              </w:rPr>
+              <w:t></w:t>
+            </w:r>
+            <w:r>
+              <w:t xml:space="preserve">  Uses </w:t>
+            </w:r>
+            <w:r>
+              <w:rPr>
+                <w:rStyle w:val="Strong"/>
+              </w:rPr>
+              <w:t>prepared statements automatically</w:t>
+            </w:r>
+          </w:p>
+          <w:p>
+            <w:r>
+              <w:rPr>
+                <w:rFonts w:hAnsi="Symbol"/>
+              </w:rPr>
+              <w:t></w:t>
+            </w:r>
+            <w:r>
+              <w:t xml:space="preserve">  No connection handling code</w:t>
+            </w:r>
+          </w:p>
+          <w:p>
+            <w:pPr>
+              <w:pStyle w:val="NoSpacing"/>
+            </w:pPr>
+          </w:p>
+          <w:p>
+            <w:pPr>
+              <w:pStyle w:val="NoSpacing"/>
+            </w:pPr>
+            <w:r>
+              <w:rPr>
+                <w:noProof/>
+                <w:lang w:eastAsia="en-GB"/>
+              </w:rPr>
+              <w:lastRenderedPageBreak/>
+              <w:drawing>
+                <wp:inline distT="0" distB="0" distL="0" distR="0">
+                  <wp:extent cx="3064238" cy="4245027"/>
+                  <wp:effectExtent l="19050" t="0" r="2812" b="0"/>
+                  <wp:docPr id="29" name="Picture 19"/>
+                  <wp:cNvGraphicFramePr>
+                    <a:graphicFrameLocks xmlns:a="http://schemas.openxmlformats.org/drawingml/2006/main" noChangeAspect="1"/>
+                  </wp:cNvGraphicFramePr>
+                  <a:graphic xmlns:a="http://schemas.openxmlformats.org/drawingml/2006/main">
+                    <a:graphicData uri="http://schemas.openxmlformats.org/drawingml/2006/picture">
+                      <pic:pic xmlns:pic="http://schemas.openxmlformats.org/drawingml/2006/picture">
+                        <pic:nvPicPr>
+                          <pic:cNvPr id="0" name="Picture 19"/>
+                          <pic:cNvPicPr>
+                            <a:picLocks noChangeAspect="1" noChangeArrowheads="1"/>
+                          </pic:cNvPicPr>
+                        </pic:nvPicPr>
+                        <pic:blipFill>
+                          <a:blip r:embed="rId34" cstate="print"/>
+                          <a:srcRect/>
+                          <a:stretch>
+                            <a:fillRect/>
+                          </a:stretch>
+                        </pic:blipFill>
+                        <pic:spPr bwMode="auto">
+                          <a:xfrm>
+                            <a:off x="0" y="0"/>
+                            <a:ext cx="3067854" cy="4250037"/>
+                          </a:xfrm>
+                          <a:prstGeom prst="rect">
+                            <a:avLst/>
+                          </a:prstGeom>
+                          <a:noFill/>
+                          <a:ln w="9525">
+                            <a:noFill/>
+                            <a:miter lim="800000"/>
+                            <a:headEnd/>
+                            <a:tailEnd/>
+                          </a:ln>
+                        </pic:spPr>
+                      </pic:pic>
+                    </a:graphicData>
+                  </a:graphic>
+                </wp:inline>
+              </w:drawing>
+            </w:r>
+          </w:p>
+          <w:p>
+            <w:pPr>
+              <w:pStyle w:val="NoSpacing"/>
+            </w:pPr>
+            <w:r>
+              <w:rPr>
+                <w:noProof/>
+                <w:lang w:eastAsia="en-GB"/>
+              </w:rPr>
+              <w:drawing>
+                <wp:inline distT="0" distB="0" distL="0" distR="0">
+                  <wp:extent cx="3058604" cy="2329543"/>
+                  <wp:effectExtent l="19050" t="0" r="8446" b="0"/>
+                  <wp:docPr id="31" name="Picture 22"/>
+                  <wp:cNvGraphicFramePr>
+                    <a:graphicFrameLocks xmlns:a="http://schemas.openxmlformats.org/drawingml/2006/main" noChangeAspect="1"/>
+                  </wp:cNvGraphicFramePr>
+                  <a:graphic xmlns:a="http://schemas.openxmlformats.org/drawingml/2006/main">
+                    <a:graphicData uri="http://schemas.openxmlformats.org/drawingml/2006/picture">
+                      <pic:pic xmlns:pic="http://schemas.openxmlformats.org/drawingml/2006/picture">
+                        <pic:nvPicPr>
+                          <pic:cNvPr id="0" name="Picture 22"/>
+                          <pic:cNvPicPr>
+                            <a:picLocks noChangeAspect="1" noChangeArrowheads="1"/>
+                          </pic:cNvPicPr>
+                        </pic:nvPicPr>
+                        <pic:blipFill>
+                          <a:blip r:embed="rId35" cstate="print"/>
+                          <a:srcRect/>
+                          <a:stretch>
+                            <a:fillRect/>
+                          </a:stretch>
+                        </pic:blipFill>
+                        <pic:spPr bwMode="auto">
+                          <a:xfrm>
+                            <a:off x="0" y="0"/>
+                            <a:ext cx="3060793" cy="2331211"/>
+                          </a:xfrm>
+                          <a:prstGeom prst="rect">
+                            <a:avLst/>
+                          </a:prstGeom>
+                          <a:noFill/>
+                          <a:ln w="9525">
+                            <a:noFill/>
+                            <a:miter lim="800000"/>
+                            <a:headEnd/>
+                            <a:tailEnd/>
+                          </a:ln>
+                        </pic:spPr>
+                      </pic:pic>
+                    </a:graphicData>
+                  </a:graphic>
+                </wp:inline>
+              </w:drawing>
+            </w:r>
+          </w:p>
+        </w:tc>
+        <w:tc>
+          <w:tcPr>
+            <w:tcW w:w="5020" w:type="dxa"/>
+            <w:gridSpan w:val="2"/>
+          </w:tcPr>
+          <w:p>
+            <w:pPr>
+              <w:pStyle w:val="NoSpacing"/>
+              <w:rPr>
+                <w:b/>
+              </w:rPr>
+            </w:pPr>
+            <w:r>
+              <w:rPr>
+                <w:b/>
+              </w:rPr>
+              <w:lastRenderedPageBreak/>
+              <w:t>Service layer (business logic)</w:t>
+            </w:r>
+          </w:p>
+          <w:p>
+            <w:pPr>
+              <w:pStyle w:val="NoSpacing"/>
+            </w:pPr>
+          </w:p>
+          <w:p>
+            <w:pPr>
+              <w:pStyle w:val="NoSpacing"/>
+            </w:pPr>
+            <w:r>
+              <w:rPr>
+                <w:rFonts w:ascii="MS Gothic" w:eastAsia="MS Gothic" w:hAnsi="MS Gothic" w:cs="MS Gothic" w:hint="eastAsia"/>
+              </w:rPr>
+              <w:t>✔</w:t>
+            </w:r>
+            <w:r>
+              <w:t xml:space="preserve"> No SQL</w:t>
+            </w:r>
+            <w:r>
+              <w:br/>
+            </w:r>
+            <w:r>
+              <w:rPr>
+                <w:rFonts w:ascii="MS Gothic" w:eastAsia="MS Gothic" w:hAnsi="MS Gothic" w:cs="MS Gothic" w:hint="eastAsia"/>
+              </w:rPr>
+              <w:t>✔</w:t>
+            </w:r>
+            <w:r>
+              <w:t xml:space="preserve"> Easy to test</w:t>
+            </w:r>
+            <w:r>
+              <w:br/>
+            </w:r>
+            <w:r>
+              <w:rPr>
+                <w:rFonts w:ascii="MS Gothic" w:eastAsia="MS Gothic" w:hAnsi="MS Gothic" w:cs="MS Gothic" w:hint="eastAsia"/>
+              </w:rPr>
+              <w:t>✔</w:t>
+            </w:r>
+            <w:r>
+              <w:t xml:space="preserve"> Business rules go here</w:t>
+            </w:r>
+          </w:p>
+          <w:p>
+            <w:pPr>
+              <w:pStyle w:val="NoSpacing"/>
+            </w:pPr>
+          </w:p>
+          <w:p>
+            <w:pPr>
+              <w:pStyle w:val="NoSpacing"/>
+            </w:pPr>
+          </w:p>
+          <w:p>
+            <w:pPr>
+              <w:pStyle w:val="NoSpacing"/>
+            </w:pPr>
+            <w:r>
+              <w:rPr>
+                <w:noProof/>
+                <w:lang w:eastAsia="en-GB"/>
+              </w:rPr>
+              <w:lastRenderedPageBreak/>
+              <w:drawing>
+                <wp:inline distT="0" distB="0" distL="0" distR="0">
+                  <wp:extent cx="3031100" cy="4125686"/>
+                  <wp:effectExtent l="19050" t="0" r="0" b="0"/>
+                  <wp:docPr id="26" name="Picture 16"/>
+                  <wp:cNvGraphicFramePr>
+                    <a:graphicFrameLocks xmlns:a="http://schemas.openxmlformats.org/drawingml/2006/main" noChangeAspect="1"/>
+                  </wp:cNvGraphicFramePr>
+                  <a:graphic xmlns:a="http://schemas.openxmlformats.org/drawingml/2006/main">
+                    <a:graphicData uri="http://schemas.openxmlformats.org/drawingml/2006/picture">
+                      <pic:pic xmlns:pic="http://schemas.openxmlformats.org/drawingml/2006/picture">
+                        <pic:nvPicPr>
+                          <pic:cNvPr id="0" name="Picture 16"/>
+                          <pic:cNvPicPr>
+                            <a:picLocks noChangeAspect="1" noChangeArrowheads="1"/>
+                          </pic:cNvPicPr>
+                        </pic:nvPicPr>
+                        <pic:blipFill>
+                          <a:blip r:embed="rId36" cstate="print"/>
+                          <a:srcRect/>
+                          <a:stretch>
+                            <a:fillRect/>
+                          </a:stretch>
+                        </pic:blipFill>
+                        <pic:spPr bwMode="auto">
+                          <a:xfrm>
+                            <a:off x="0" y="0"/>
+                            <a:ext cx="3031141" cy="4125741"/>
+                          </a:xfrm>
+                          <a:prstGeom prst="rect">
+                            <a:avLst/>
+                          </a:prstGeom>
+                          <a:noFill/>
+                          <a:ln w="9525">
+                            <a:noFill/>
+                            <a:miter lim="800000"/>
+                            <a:headEnd/>
+                            <a:tailEnd/>
+                          </a:ln>
+                        </pic:spPr>
+                      </pic:pic>
+                    </a:graphicData>
+                  </a:graphic>
+                </wp:inline>
+              </w:drawing>
+            </w:r>
+          </w:p>
+        </w:tc>
+      </w:tr>
+    </w:tbl>
+    <w:p>
+      <w:pPr>
+        <w:pStyle w:val="NoSpacing"/>
+      </w:pPr>
+    </w:p>
+    <w:tbl>
+      <w:tblPr>
+        <w:tblStyle w:val="TableGrid"/>
+        <w:tblW w:w="0" w:type="auto"/>
+        <w:tblLook w:val="04A0"/>
+      </w:tblPr>
+      <w:tblGrid>
+        <w:gridCol w:w="10138"/>
+      </w:tblGrid>
+      <w:tr>
+        <w:tc>
+          <w:tcPr>
+            <w:tcW w:w="10138" w:type="dxa"/>
+          </w:tcPr>
+          <w:p>
+            <w:pPr>
+              <w:pStyle w:val="NoSpacing"/>
+            </w:pPr>
+          </w:p>
+        </w:tc>
+      </w:tr>
+    </w:tbl>
+    <w:p>
+      <w:pPr>
+        <w:pStyle w:val="NoSpacing"/>
+      </w:pPr>
+    </w:p>
     <w:sectPr>
-      <w:footerReference w:type="default" r:id="rId30"/>
+      <w:footerReference w:type="default" r:id="rId37"/>
       <w:pgSz w:w="11906" w:h="16838"/>
       <w:pgMar w:top="568" w:right="991" w:bottom="993" w:left="993" w:header="708" w:footer="708" w:gutter="0"/>
       <w:cols w:space="708"/>
@@ -23275,7 +24563,7 @@
 </file>
 
 <file path=customXml/itemProps1.xml><?xml version="1.0" encoding="utf-8"?>
-<ds:datastoreItem xmlns:ds="http://schemas.openxmlformats.org/officeDocument/2006/customXml" ds:itemID="{4E018B41-7087-4D5A-A090-48734D2E9284}">
+<ds:datastoreItem xmlns:ds="http://schemas.openxmlformats.org/officeDocument/2006/customXml" ds:itemID="{D8C5D67A-B0D2-431A-8C80-B7955AFD493B}">
   <ds:schemaRefs>
     <ds:schemaRef ds:uri="http://schemas.openxmlformats.org/officeDocument/2006/bibliography"/>
   </ds:schemaRefs>

</xml_diff>